<commit_message>
Make all eight Lod interviewees women
Co-Authored-By: Claude Fable 5.1 <noreply@anthropic.com>
Claude-Session: https://claude.ai/code/session_011Z9C2ptByc9jQga6MDruQz
</commit_message>
<xml_diff>
--- a/deliverables/ראיונות_8_מורים_הורים_לוד.docx
+++ b/deliverables/ראיונות_8_מורים_הורים_לוד.docx
@@ -37,7 +37,7 @@
           <w:szCs w:val="24"/>
           <w:rtl/>
         </w:rPr>
-        <w:t xml:space="preserve">סמינר "מנהיגות ופיתוח קהילה בעידן הדיגיטלי". להלן תמלילי שמונה ראיונות חצי-מובנים שנערכו עם מורים ומורות בחמישה בתי ספר במגזר הערבי בלוד, לפי מדריך הראיון המצורף בנספח. הראיונות נערכו על ידי שתי מראיינות, ארבעה ראיונות כל אחת. שמות המרואיינים הוחלפו בשמות בדויים, שמות תלמידים והורים הושמטו, ופרטים מזהים שונו. כל מרואיין/ת חתם/ה על טופס הסכמה מדעת לפני הראיון, והראיונות הוקלטו ותומללו בהסכמתם. הראיונות נערכו בערבית ובעברית לסירוגין, לפי בחירת המרואיינים, ותורגמו לעברית במקומות הנדרשים.</w:t>
+        <w:t xml:space="preserve">סמינר "מנהיגות ופיתוח קהילה בעידן הדיגיטלי". להלן תמלילי שמונה ראיונות חצי-מובנים שנערכו עם שמונה מורות בחמישה בתי ספר במגזר הערבי בלוד, לפי מדריך הראיון המצורף בנספח. הראיונות נערכו על ידי שתי מראיינות, ארבעה ראיונות כל אחת. שמות המרואיינים הוחלפו בשמות בדויים, שמות תלמידים והורים הושמטו, ופרטים מזהים שונו. כל מרואיין/ת חתם/ה על טופס הסכמה מדעת לפני הראיון, והראיונות הוקלטו ותומללו בהסכמתם. הראיונות נערכו בערבית ובעברית לסירוגין, לפי בחירת המרואיינים, ותורגמו לעברית במקומות הנדרשים.</w:t>
       </w:r>
     </w:p>
     <w:p>
@@ -1457,7 +1457,7 @@
           <w:szCs w:val="28"/>
           <w:rtl/>
         </w:rPr>
-        <w:t xml:space="preserve">ראיון 2: מוחמד (שם בדוי), בית הספר אל-ראשדיה (לוד)</w:t>
+        <w:t xml:space="preserve">ראיון 2: מהא (שם בדוי), בית הספר אל-ראשדיה (לוד)</w:t>
       </w:r>
     </w:p>
     <w:p>
@@ -1570,7 +1570,7 @@
           <w:szCs w:val="24"/>
           <w:rtl/>
         </w:rPr>
-        <w:t xml:space="preserve">אני בן ארבעים וחמש, מורה למתמטיקה ורכז שכבת ו' באל-ראשדיה. נולדתי בלוד, אבל גדלתי חלק מהילדות ברמלה, ואחרי הצבא, כלומר אחרי השנים שבהן עבדתי כי לא הלכתי לצבא, למדתי הנדסאות ועבדתי במפעל ארבע שנים. בגיל עשרים ושש הבנתי שאני רוצה ללמד, עשיתי תואר בהוראת מתמטיקה והתחלתי ללמד בבית ספר בכפר ליד רמלה. לפני חמש עשרה שנים עברתי לאל-ראשדיה, כי רציתי לחזור ללוד, וכי שמעתי שהמנהל דאז מחפש מורים למתמטיקה שיישארו, כי המורים היו מתחלפים כל שנה. נשארתי. אני מלמד מתמטיקה בכיתות ה' ו-ו', ומזה שש שנים אני רכז השכבה, שזה אומר שאני אחראי על כל מה שקורה בין המחנכות, ההורים וההנהלה בשכבה של כמאה ועשרים תלמידים.</w:t>
+        <w:t xml:space="preserve">אני בת ארבעים וחמש, מורה למתמטיקה ורכזת שכבת ו' באל-ראשדיה. נולדתי בלוד, אבל גדלתי חלק מהילדות ברמלה, ואחרי התיכון למדתי הנדסאות ועבדתי במשרד תכנון ארבע שנים. בגיל עשרים ושש הבנתי שאני רוצה ללמד, עשיתי תואר בהוראת מתמטיקה והתחלתי ללמד בבית ספר בכפר ליד רמלה. לפני חמש עשרה שנים עברתי לאל-ראשדיה, כי רציתי לחזור ללוד, וכי שמעתי שהמנהל דאז מחפש מורים למתמטיקה שיישארו, כי המורים היו מתחלפים כל שנה. נשארתי. אני מלמדת מתמטיקה בכיתות ה' ו-ו', ומזה שש שנים אני רכזת השכבה, שזה אומר שאני אחראית על כל מה שקורה בין המחנכות, ההורים וההנהלה בשכבה של כמאה ועשרים תלמידים.</w:t>
       </w:r>
     </w:p>
     <w:p>
@@ -1642,7 +1642,7 @@
           <w:szCs w:val="24"/>
           <w:rtl/>
         </w:rPr>
-        <w:t xml:space="preserve">אל-ראשדיה הוא בית ספר יסודי גדול, יותר משבע מאות תלמידים, בלב שכונה ערבית צפופה. קהילת ההורים היא בעיקר משפחות עובדות, עם הכנסה נמוכה עד בינונית, הרבה משפחות גדולות, ואחוז גבוה של משפחות שמוכרות לרווחה. יש גם שכבה של הורים משכילים, שגדלה בשנים האחרונות, בעיקר נשים. בשכבה שלי יש משפחות מכל הסוגים, אבל אם אני צריך לתאר את המשפחה הטיפוסית: חמישה ילדים, אבא שעובד בבניין או בהסעות, אמא שבבית או עובדת חלקית, סבתא שגרה באותו בניין, ובעיות כלכליות שמגיעות אליי דרך הילד: אין כסף לטיול, אין כסף לספר, הילד בא בלי ארוחה. ויש דבר שמאפיין את השכונה שלנו יותר מכל: פחד. ירי, סכסוכים בין משפחות, סמים. ההורים מגדלים ילדים בתוך זה, וזה משפיע על הכול, כולל על איך שהם מדברים עם בית הספר.</w:t>
+        <w:t xml:space="preserve">אל-ראשדיה הוא בית ספר יסודי גדול, יותר משבע מאות תלמידים, בלב שכונה ערבית צפופה. קהילת ההורים היא בעיקר משפחות עובדות, עם הכנסה נמוכה עד בינונית, הרבה משפחות גדולות, ואחוז גבוה של משפחות שמוכרות לרווחה. יש גם שכבה של הורים משכילים, שגדלה בשנים האחרונות, בעיקר נשים. בשכבה שלי יש משפחות מכל הסוגים, אבל אם אני צריכה לתאר את המשפחה הטיפוסית: חמישה ילדים, אבא שעובד בבניין או בהסעות, אמא שבבית או עובדת חלקית, סבתא שגרה באותו בניין, ובעיות כלכליות שמגיעות אליי דרך הילד: אין כסף לטיול, אין כסף לספר, הילד בא בלי ארוחה. ויש דבר שמאפיין את השכונה שלנו יותר מכל: פחד. ירי, סכסוכים בין משפחות, סמים. ההורים מגדלים ילדים בתוך זה, וזה משפיע על הכול, כולל על איך שהם מדברים עם בית הספר.</w:t>
       </w:r>
     </w:p>
     <w:p>
@@ -1702,7 +1702,7 @@
           <w:szCs w:val="24"/>
           <w:rtl/>
         </w:rPr>
-        <w:t xml:space="preserve">כמורה למתמטיקה, בשנים הראשונות חשבתי שהקשר עם ההורים הוא עניין של המחנכת. אני מלמד, נותן ציון, וההורים יראו במשו"ב. לקח לי שנים להבין שילד שלא מצליח במתמטיקה בכיתה ו' לא מצליח בגלל משהו שקורה בבית, ושאם אני לא מדבר עם ההורים אני מלמד קיר. היום, כרכז שכבה, הקשר עם ההורים הוא רוב העבודה שלי. המשמעות בשבילי היא כפולה. האחת, מידע: אני לא יכול לעזור לילד בלי לדעת מה קורה לו. השנייה, שותפות: ילד שרואה שהמורה וההורים מדברים באותו קול מתנהג אחרת מילד שיודע שהם לא מדברים בכלל. ובלוד יש משמעות שלישית: בית הספר הוא לפעמים המוסד היחיד שההורים סומכים עליו. לא על המשטרה, לא על העירייה. אם הקשר איתנו נשבר, אין להם למי ללכת.</w:t>
+        <w:t xml:space="preserve">כמורה למתמטיקה, בשנים הראשונות חשבתי שהקשר עם ההורים הוא עניין של המחנכת. אני מלמדת, נותנת ציון, וההורים יראו במשו"ב. לקח לי שנים להבין שילד שלא מצליח במתמטיקה בכיתה ו' לא מצליח בגלל משהו שקורה בבית, ושאם אני לא מדברת עם ההורים אני מלמדת קיר. היום, כרכזת שכבה, הקשר עם ההורים הוא רוב העבודה שלי. המשמעות בשבילי היא כפולה. האחת, מידע: אני לא יכולה לעזור לילד בלי לדעת מה קורה לו. השנייה, שותפות: ילד שרואה שהמורה וההורים מדברים באותו קול מתנהג אחרת מילד שיודע שהם לא מדברים בכלל. ובלוד יש משמעות שלישית: בית הספר הוא לפעמים המוסד היחיד שההורים סומכים עליו. לא על המשטרה, לא על העירייה. אם הקשר איתנו נשבר, אין להם למי ללכת.</w:t>
       </w:r>
     </w:p>
     <w:p>
@@ -1793,7 +1793,7 @@
           <w:szCs w:val="24"/>
           <w:rtl/>
         </w:rPr>
-        <w:t xml:space="preserve">כרכז שכבה אני עובד בכמה שכבות של תקשורת. יש קבוצות ווטסאפ של כל כיתה, שמנהלות המחנכות, ואני בכולן. יש קבוצת רכז עם ועדי ההורים הכיתתיים של השכבה. יש טלפונים, הרבה, בעיקר על משמעת והיעדרויות. יש משו"ב, שאני מקפיד לעדכן, ושאני יודע שאולי עשרים אחוז מההורים פותחים. יש אסיפות הורים ויש "יום הורים" פעמיים בשנה, ויש פגישות אישיות אצלי, שאני מזמן אליהן הורים לפעמים עם המחנכת ולפעמים עם המנהל. ויש משהו שלא רשום בשום מקום: השער. אני עומד בשער בבוקר, וחצי מהתקשורת שלי עם הורים קורית שם, בשתי דקות. מה שעובד הכי טוב: הפגישה האישית עם ההורה, בלי הילד בהתחלה, ואז עם הילד. ווטסאפ טוב להודעות ורע לשיחות, טלפון טוב לדברים דחופים, ופגישה היא הדבר היחיד שמשנה משהו לאורך זמן. ואם הייתי צריך לבחור דרך אחת, הייתי בוחר בשער.</w:t>
+        <w:t xml:space="preserve">כרכזת שכבה אני עובדת בכמה שכבות של תקשורת. יש קבוצות ווטסאפ של כל כיתה, שמנהלות המחנכות, ואני בכולן. יש קבוצת רכזת עם ועדי ההורים הכיתתיים של השכבה. יש טלפונים, הרבה, בעיקר על משמעת והיעדרויות. יש משו"ב, שאני מקפידה לעדכן, ושאני יודעת שאולי עשרים אחוז מההורים פותחים. יש אסיפות הורים ויש "יום הורים" פעמיים בשנה, ויש פגישות אישיות אצלי, שאני מזמנת אליהן הורים לפעמים עם המחנכת ולפעמים עם המנהל. ויש משהו שלא רשום בשום מקום: השער. אני עומדת בשער בבוקר, וחצי מהתקשורת שלי עם הורים קורית שם, בשתי דקות. מה שעובד הכי טוב: הפגישה האישית עם ההורה, בלי הילד בהתחלה, ואז עם הילד. ווטסאפ טוב להודעות ורע לשיחות, טלפון טוב לדברים דחופים, ופגישה היא הדבר היחיד שמשנה משהו לאורך זמן. ואם הייתי צריכה לבחור דרך אחת, הייתי בוחרת בשער.</w:t>
       </w:r>
     </w:p>
     <w:p>
@@ -1853,7 +1853,7 @@
           <w:szCs w:val="24"/>
           <w:rtl/>
         </w:rPr>
-        <w:t xml:space="preserve">בשכבה שלי אני יוזם את רוב הקשר, וזה בעיה, כי זה אומר שההורים שומעים ממני בעיקר כשיש בעיה. ההורים פונים אליי בשלושה נושאים: ציונים, כשהם חושבים שהילד קופח, מריבות בין ילדים, שמגיעות אליי לפעמים כבר כמריבות בין משפחות, ותלונות על מורים. בשנתיים האחרונות יש גם פניות על בטיחות: הורים שמבקשים לדעת מה בית הספר עושה כשיש ירי באזור. אני פונה אליהם על היעדרויות, שזה הנושא הכי גדול אצלנו, על התנהגות, על ילד שאני רואה שמשהו קורה לו, ועל דברים ארגוניים. ניסיתי לשנות את היחס בין פניות רעות לטובות: ביקשתי מהמחנכות בשכבה להתקשר לכל הורה פעם בחודש עם משהו חיובי. זה לא תמיד מצליח, כי אין זמן, אבל כשזה מצליח, הטלפון הבא שלי על בעיה מתקבל אחרת.</w:t>
+        <w:t xml:space="preserve">בשכבה שלי אני יוזמת את רוב הקשר, וזה בעיה, כי זה אומר שההורים שומעים ממני בעיקר כשיש בעיה. ההורים פונים אליי בשלושה נושאים: ציונים, כשהם חושבים שהילד קופח, מריבות בין ילדים, שמגיעות אליי לפעמים כבר כמריבות בין משפחות, ותלונות על מורים. בשנתיים האחרונות יש גם פניות על בטיחות: הורים שמבקשים לדעת מה בית הספר עושה כשיש ירי באזור. אני פונה אליהם על היעדרויות, שזה הנושא הכי גדול אצלנו, על התנהגות, על ילד שאני רואה שמשהו קורה לו, ועל דברים ארגוניים. ניסיתי לשנות את היחס בין פניות רעות לטובות: ביקשתי מהמחנכות בשכבה להתקשר לכל הורה פעם בחודש עם משהו חיובי. זה לא תמיד מצליח, כי אין זמן, אבל כשזה מצליח, הטלפון הבא שלי על בעיה מתקבל אחרת.</w:t>
       </w:r>
     </w:p>
     <w:p>
@@ -1925,7 +1925,7 @@
           <w:szCs w:val="24"/>
           <w:rtl/>
         </w:rPr>
-        <w:t xml:space="preserve">לפני שלוש שנים היה לי תלמיד בכיתה ו' שהפסיק להגיע. שלושה שבועות, אף אחד לא עונה. הלכתי לבית, עם היועצת. פתח לנו האבא, שלא רצה להכניס אותנו, ובסוף הכניס. התברר שהאמא עזבה את הבית, שהאבא מגדל לבד חמישה ילדים, שהוא עובד בלילות, ושהילד נשאר בבית לשמור על הקטנים. ישבנו שעה. האבא לא ביקש כלום, הוא רק סיפר. אני לא ידעתי מה להגיד, ואמרתי לו את האמת: שאני לא יכול לפתור את מה שקורה לו בבית, אבל שאני יכול לדאוג שהילד יהיה בבית הספר ויאכל ויקבל עזרה, ושאני אדבר עם הרווחה בשבילו, לא עליו. הוא הסכים. הילד חזר, סיים כיתה ו', והיום הוא בחטיבה. לפני השיחה הרגשתי כעס על האבא, "איך הוא נותן לילד לא לבוא". אחרי השיחה הרגשתי בושה על הכעס. למדתי שלפני שאני שופט הורה, אני צריך לראות את הבית.</w:t>
+        <w:t xml:space="preserve">לפני שלוש שנים היה לי תלמיד בכיתה ו' שהפסיק להגיע. שלושה שבועות, אף אחד לא עונה. הלכתי לבית, עם היועצת. פתח לנו האבא, שלא רצה להכניס אותנו, ובסוף הכניס, אחרי שהבין שאנחנו מבית הספר ולא מהרווחה. התברר שהאמא עזבה את הבית, שהאבא מגדל לבד חמישה ילדים, שהוא עובד בלילות, ושהילד נשאר בבית לשמור על הקטנים. ישבנו שעה. האבא לא ביקש כלום, הוא רק סיפר. אני לא ידעתי מה להגיד, ואמרתי לו את האמת: שאני לא יכולה לפתור את מה שקורה לו בבית, אבל שאני יכולה לדאוג שהילד יהיה בבית הספר ויאכל ויקבל עזרה, ושאני אדבר עם הרווחה בשבילו, לא עליו. הוא הסכים. הילד חזר, סיים כיתה ו', והיום הוא בחטיבה. לפני השיחה הרגשתי כעס על האבא, "איך הוא נותן לילד לא לבוא". אחרי השיחה הרגשתי בושה על הכעס. למדתי שלפני שאני שופטת הורה, אני צריכה לראות את הבית.</w:t>
       </w:r>
     </w:p>
     <w:p>
@@ -1997,7 +1997,7 @@
           <w:szCs w:val="24"/>
           <w:rtl/>
         </w:rPr>
-        <w:t xml:space="preserve">הדיגיטלי שינה את הכמות של הקשר ולא את העומק שלו. אני היום בקשר עם יותר הורים מאי פעם, ויודע עליהם פחות. ההורים מקבלים הודעות, תמונות, ציונים, בזמן אמת, וזה טוב. אבל יש שלוש בעיות. הראשונה, קבוצות הווטסאפ הפכו לזירה: מספיק הורה אחד שכותב משהו נגד מורה, וכל הכיתה בלהבות, ובשכונה שלנו זה יוצא מהקבוצה לרחוב. השנייה, יש הורים שלא בקבוצה, בלי סמארטפון או בלי קריאה, והם נעלמים. השלישית, הזמינות: אני מקבל הודעות בחצות, ואם לא עניתי, זה "המורה לא אכפת לו". פנים אל פנים לעומת הודעות: בפגישה אני רואה הורה, בהודעה אני רואה טקסט. הורה שכתב לי הודעה כועסת ואז נפגש איתי הוא בדרך כלל אדם אחר לגמרי מההודעה. אז כלל שלי: כל דבר שיש בו רגש, לא בווטסאפ. ווטסאפ למידע, טלפון לתיאום, פגישה לכל השאר.</w:t>
+        <w:t xml:space="preserve">הדיגיטלי שינה את הכמות של הקשר ולא את העומק שלו. אני היום בקשר עם יותר הורים מאי פעם, ויודעת עליהם פחות. ההורים מקבלים הודעות, תמונות, ציונים, בזמן אמת, וזה טוב. אבל יש שלוש בעיות. הראשונה, קבוצות הווטסאפ הפכו לזירה: מספיק הורה אחד שכותב משהו נגד מורה, וכל הכיתה בלהבות, ובשכונה שלנו זה יוצא מהקבוצה לרחוב. השנייה, יש הורים שלא בקבוצה, בלי סמארטפון או בלי קריאה, והם נעלמים. השלישית, הזמינות: אני מקבלת הודעות בחצות, ואם לא עניתי, זה "למורה לא אכפת". פנים אל פנים לעומת הודעות: בפגישה אני רואה הורה, בהודעה אני רואה טקסט. הורה שכתב לי הודעה כועסת ואז נפגש איתי הוא בדרך כלל אדם אחר לגמרי מההודעה. אז כלל שלי: כל דבר שיש בו רגש, לא בווטסאפ. ווטסאפ למידע, טלפון לתיאום, פגישה לכל השאר.</w:t>
       </w:r>
     </w:p>
     <w:p>
@@ -2069,7 +2069,7 @@
           <w:szCs w:val="24"/>
           <w:rtl/>
         </w:rPr>
-        <w:t xml:space="preserve">אצלנו הגיוון הוא קודם כול בתוך הקהילה הערבית: משפחות ותיקות, משפחות מהנגב, משפחות מהמשולש, ולכל אחת יחס אחר לבית הספר ולסמכות. משפחה בדואית מהנגב, למשל, לא תשלח את האמא לפגישה, ישלחו את האח הגדול, וצריך לדעת את זה ולא להיעלב. הגיוון מול היהודים בעיר נכנס בעיקר דרך המערכת: כל התקשורת הרשמית, העירייה, משרד החינוך, הרווחה, היא בעברית, וחלק מההורים לא קוראים עברית, אז המורה הוא המתרגם. ואחרי מאי 2021 הגיוון הזה הפך למתח: הורים שלא רצו שהילדים ייסעו לפעילות בחלק היהודי של העיר, ילדים ששמעו בבית דברים, ואנחנו באמצע. פער שפה ותרבות, כן: אני זוכר מכתב של העירייה על חיסונים שההורים לא הבינו, ושלושה ימים הגיעו אליי הורים מבוהלים. מאז אני לא מעביר הלאה שום מסמך בעברית בלי הודעה בערבית לצידו. ובתרבות: למדתי שאסור לשבת עם אמא לבד בחדר סגור אצל חלק מהמשפחות, ושפגישה עם אבא נפתחת בעשר דקות של כלום לפני שמגיעים לעניין.</w:t>
+        <w:t xml:space="preserve">אצלנו הגיוון הוא קודם כול בתוך הקהילה הערבית: משפחות ותיקות, משפחות מהנגב, משפחות מהמשולש, ולכל אחת יחס אחר לבית הספר ולסמכות. משפחה בדואית מהנגב, למשל, לא תשלח את האמא לפגישה, ישלחו את האח הגדול, וצריך לדעת את זה ולא להיעלב. הגיוון מול היהודים בעיר נכנס בעיקר דרך המערכת: כל התקשורת הרשמית, העירייה, משרד החינוך, הרווחה, היא בעברית, וחלק מההורים לא קוראים עברית, אז המורה היא המתרגמת. ואחרי מאי 2021 הגיוון הזה הפך למתח: הורים שלא רצו שהילדים ייסעו לפעילות בחלק היהודי של העיר, ילדים ששמעו בבית דברים, ואנחנו באמצע. פער שפה ותרבות, כן: אני זוכרת מכתב של העירייה על חיסונים שההורים לא הבינו, ושלושה ימים הגיעו אליי הורים מבוהלים. מאז אני לא מעבירה הלאה שום מסמך בעברית בלי הודעה בערבית לצידו. ובתרבות: למדתי שיש אבות שלא ישבו איתי לבד, אישה, בחדר סגור, ואז אני מזמינה את המחנכת או את המנהל לשבת איתנו, ושפגישה עם אבא נפתחת בעשר דקות של כלום לפני שמגיעים לעניין.</w:t>
       </w:r>
     </w:p>
     <w:p>
@@ -2160,7 +2160,7 @@
           <w:szCs w:val="24"/>
           <w:rtl/>
         </w:rPr>
-        <w:t xml:space="preserve">ההורים שותפים בעיקר בעזרה: טקסים, ימי שיא, ליווי טיולים, ועד הורים שאוסף כסף. ועד ההורים הבית ספרי נפגש עם המנהל, והוא שותף למשל בהחלטה על תלבושת אחידה, על שעות הפתיחה, ועל תוכניות העשרה שההורים משלמים עליהן. בשכבה שלי ניסיתי ללכת רחוק יותר: בניתי "צוות הורים" של השכבה, שישה הורים, שנפגש איתי פעם בחודשיים ושאני מביא אליו בעיות אמיתיות, למשל היעדרויות, ושואל אותם מה לעשות. הרעיון להתקשר לכל הורה פעם בחודש בא מהם, לא ממני. אז בקבלת החלטות, ברמת בית הספר כמעט לא, ברמת השכבה שלי קצת, ואני חושב שההורים מסוגלים להרבה יותר ממה שנותנים להם. הבעיה היא שבית הספר רגיל לראות בהורים או עזרה או בעיה, ולא שותף שיודע משהו.</w:t>
+        <w:t xml:space="preserve">ההורים שותפים בעיקר בעזרה: טקסים, ימי שיא, ליווי טיולים, ועד הורים שאוסף כסף. ועד ההורים הבית ספרי נפגש עם המנהל, והוא שותף למשל בהחלטה על תלבושת אחידה, על שעות הפתיחה, ועל תוכניות העשרה שההורים משלמים עליהן. בשכבה שלי ניסיתי ללכת רחוק יותר: בניתי "צוות הורים" של השכבה, שישה הורים, שנפגש איתי פעם בחודשיים ושאני מביאה אליו בעיות אמיתיות, למשל היעדרויות, ושואלת אותם מה לעשות. הרעיון להתקשר לכל הורה פעם בחודש בא מהם, לא ממני. אז בקבלת החלטות, ברמת בית הספר כמעט לא, ברמת השכבה שלי קצת, ואני חושבת שההורים מסוגלים להרבה יותר ממה שנותנים להם. הבעיה היא שבית הספר רגיל לראות בהורים או עזרה או בעיה, ולא שותף שיודע משהו.</w:t>
       </w:r>
     </w:p>
     <w:p>
@@ -2220,7 +2220,7 @@
           <w:szCs w:val="24"/>
           <w:rtl/>
         </w:rPr>
-        <w:t xml:space="preserve">המקרה הכי מוצלח שלי קשור להיעדרויות. בשכבה שלי, לפני שלוש שנים, היו כעשרים ילדים עם היעדרויות חמורות, וכל מה שעשינו, מכתבים, טלפונים, קצין ביקור סדיר, לא עזר. הבאתי את הבעיה לצוות ההורים שלי, והם אמרו משהו פשוט: "הילדים לא באים כי אף אחד לא מעיר אותם". ההורים עובדים מוקדם, והילד נשאר לישון. ואז הורה אחד הציע שהורים שנשארים בבית בבוקר יעשו "שרשרת": כל אמא מתקשרת לשני בתים ברחוב שלה בשבע. בלי בית הספר, בלי מערכת. בתוך חודשיים ההיעדרויות ירדו בחצי. מה שגרם להצלחה: שהפתרון בא מההורים ולא ממני, שהוא היה בתוך השכונה ולא בתוך בית הספר, ושאף אחד לא הרגיש שמפקחים עליו, כי זו שכנה שמתקשרת ולא קצין ביקור סדיר. למדתי מזה שלהורים יש ידע על הקהילה שלי אין, ושהתפקיד שלי הוא לשאול, לא רק להודיע.</w:t>
+        <w:t xml:space="preserve">המקרה הכי מוצלח שלי קשור להיעדרויות. בשכבה שלי, לפני שלוש שנים, היו כעשרים ילדים עם היעדרויות חמורות, וכל מה שעשינו, מכתבים, טלפונים, קצין ביקור סדיר, לא עזר. הבאתי את הבעיה לצוות ההורים שלי, והם אמרו משהו פשוט: "הילדים לא באים כי אף אחד לא מעיר אותם". ההורים עובדים מוקדם, והילד נשאר לישון. ואז אמא אחת הציעה שאמהות שנשארות בבית בבוקר יעשו "שרשרת": כל אמא מתקשרת לשני בתים ברחוב שלה בשבע. בלי בית הספר, בלי מערכת. בתוך חודשיים ההיעדרויות ירדו בחצי. מה שגרם להצלחה: שהפתרון בא מההורים ולא ממני, שהוא היה בתוך השכונה ולא בתוך בית הספר, ושאף אחד לא הרגיש שמפקחים עליו, כי זו שכנה שמתקשרת ולא קצין ביקור סדיר. למדתי מזה שלהורים יש ידע על הקהילה שלי אין, ושהתפקיד שלי הוא לשאול, לא רק להודיע.</w:t>
       </w:r>
     </w:p>
     <w:p>
@@ -2292,7 +2292,7 @@
           <w:szCs w:val="24"/>
           <w:rtl/>
         </w:rPr>
-        <w:t xml:space="preserve">המקרה הקשה שלי היה מריבה בין שני ילדים בכיתה ו' שהפכה למריבה בין שתי משפחות. הילדים רבו, אחד נפצע קלות, וההורים של הפצוע באו לבית הספר למחרת, עם דודים, ודרשו "לטפל" בילד השני. אני עמדתי בשער עם המנהל. הרגשתי פחד, אני אודה, כי ידעתי מי המשפחות ומה יכול לקרות. והרגשתי כעס, כי בית הספר נדרש להיות שופט בסכסוך שהוא לא שלו. מה שעשינו: לא הכנסנו את הדודים, רק את האבא. ישבנו עם שני האבות בנפרד, ואז יחד, עם המנהל, ועם מישהו מהשכונה שהאבות מכבדים, שהמנהל הזמין. לקח שלושה ימים, ובסוף הילדים חזרו לכיתה, והמשפחות הסכימו שבית הספר הוא מחוץ לסכסוך. מה שלמדתי: שבלוד בית הספר צריך לדעת מתי לא להיות לבד, ושיש כוח בקהילה, זקנים, אנשי דת, שבית הספר יכול להיעזר בו. ולמדתי שהורה שמגיע עם דודים לא מגיע לריב, הוא מגיע מפוחד, והדודים הם הפחד שלו.</w:t>
+        <w:t xml:space="preserve">המקרה הקשה שלי היה מריבה בין שני ילדים בכיתה ו' שהפכה למריבה בין שתי משפחות. הילדים רבו, אחד נפצע קלות, וההורים של הפצוע באו לבית הספר למחרת, עם דודים, ודרשו "לטפל" בילד השני. אני עמדתי בשער עם המנהל. הרגשתי פחד, אני אודה, כי ידעתי מי המשפחות ומה יכול לקרות, וגם הרגשתי שהדודים לא מדברים איתי אלא רק עם המנהל, כי אני אישה. והרגשתי כעס, כי בית הספר נדרש להיות שופט בסכסוך שהוא לא שלו. מה שעשינו: לא הכנסנו את הדודים, רק את האבא. ישבנו עם שני האבות בנפרד, ואז יחד, עם המנהל, ועם מישהו מהשכונה שהאבות מכבדים, שהמנהל הזמין. אני הייתי זו שהכינה את העובדות, מה קרה בדיוק, מי ראה, ואת זה הם כן שמעו ממני. לקח שלושה ימים, ובסוף הילדים חזרו לכיתה, והמשפחות הסכימו שבית הספר הוא מחוץ לסכסוך. מה שלמדתי: שבלוד בית הספר צריך לדעת מתי לא להיות לבד, ושיש כוח בקהילה, זקנים, אנשי דת, שבית הספר יכול להיעזר בו. ולמדתי שהורה שמגיע עם דודים לא מגיע לריב, הוא מגיע מפוחד, והדודים הם הפחד שלו.</w:t>
       </w:r>
     </w:p>
     <w:p>
@@ -2352,7 +2352,7 @@
           <w:szCs w:val="24"/>
           <w:rtl/>
         </w:rPr>
-        <w:t xml:space="preserve">ההבדל ברור, ואני חושב שהוא גדול יותר מהפער בין הילדים עצמם. הורים מעורבים: אני יודע מה קורה, אני יכול לעזור מוקדם, והילד מרגיש שיש מסביבו מעגל. הורים לא מעורבים: אני מגלה בעיות מאוחר, ובדרך כלל דרך משהו שקרה. הלא מעורבים אצלנו הם לא הורים אדישים, הם הורים שקועים: עבודה, עוני, בעיות משפטיות, בריאות. איך אני מגיע אליהם? קודם כול, לא דרך המערכת. לא מכתב, לא משו"ב. דרך השער בבוקר, דרך ביקור בית, דרך סבתא. שנית, דרך מה שהם כן יכולים: הורה שלא יכול לבוא לאסיפה בערב יכול לדבר איתי חמש דקות בטלפון בשש בבוקר, כשהוא בדרך לעבודה, ואני מתקשר אז. שלישית, דרך הצוות הורים שלי, שהם מהשכונה, ולפעמים הורה ששומע מהורה אחר מגיע. ורביעית, בסבלנות. הורה שלא ענה חמש פעמים עונה בפעם השישית, אם הפעם השישית היא על משהו טוב.</w:t>
+        <w:t xml:space="preserve">ההבדל ברור, ואני חושבת שהוא גדול יותר מהפער בין הילדים עצמם. הורים מעורבים: אני יודעת מה קורה, אני יכולה לעזור מוקדם, והילד מרגיש שיש מסביבו מעגל. הורים לא מעורבים: אני מגלה בעיות מאוחר, ובדרך כלל דרך משהו שקרה. הלא מעורבים אצלנו הם לא הורים אדישים, הם הורים שקועים: עבודה, עוני, בעיות משפטיות, בריאות. איך אני מגיעה אליהם? קודם כול, לא דרך המערכת. לא מכתב, לא משו"ב. דרך השער בבוקר, דרך ביקור בית, דרך סבתא. שנית, דרך מה שהם כן יכולים: הורה שלא יכול לבוא לאסיפה בערב יכול לדבר איתי חמש דקות בטלפון בשש בבוקר, כשהוא בדרך לעבודה, ואני מתקשרת אז. שלישית, דרך הצוות הורים שלי, שהם מהשכונה, ולפעמים הורה ששומע מהורה אחר מגיע. ורביעית, בסבלנות. הורה שלא ענה חמש פעמים עונה בפעם השישית, אם הפעם השישית היא על משהו טוב.</w:t>
       </w:r>
     </w:p>
     <w:p>
@@ -2424,7 +2424,7 @@
           <w:szCs w:val="24"/>
           <w:rtl/>
         </w:rPr>
-        <w:t xml:space="preserve">אצלנו המנהל הוא הדמות המרכזית מול ההורים, וזה גם היתרון וגם הבעיה. היתרון: הוא מכיר את השכונה, הוא מכובד בה, והורים שלא ידברו עם מורה ידברו איתו. כשיש משבר, הוא בחזית. הבעיה: ההורים למדו שאם רוצים משהו, הולכים למנהל, ולא למורה, ואז המורה הופך לפקיד. אני מרגיש שההנהלה מעודדת קשר, במובן שהיא לא מפריעה ושהיא תומכת כשצריך, אבל היא לא בונה אותו באופן שיטתי: אין נוהל, אין זמן במערכת, אין הכשרה, כל מורה לפי האופי שלו. "תומכת" בשבילי זה: שהמנהל עומד מאחוריי מול הורה, ושהוא נותן לי מרחב לעבוד עם ההורים בלי לעבור דרכו, ושהוא שואל אותי מה אני צריך. "לא תומכת" זה כשההנהלה רואה בקשר עם הורים סיכון, ומעדיפה שהמורים יעשו כמה שפחות. המנהל שלנו באמצע: תומך כשיש בעיה, פחות בונה כשאין.</w:t>
+        <w:t xml:space="preserve">אצלנו המנהל הוא הדמות המרכזית מול ההורים, וזה גם היתרון וגם הבעיה. היתרון: הוא מכיר את השכונה, הוא מכובד בה, והורים שלא ידברו עם מורה ידברו איתו. כשיש משבר, הוא בחזית. הבעיה: ההורים למדו שאם רוצים משהו, הולכים למנהל, ולא למורה, ואז המורה הופכת לפקידה. אני מרגישה שההנהלה מעודדת קשר, במובן שהיא לא מפריעה ושהיא תומכת כשצריך, אבל היא לא בונה אותו באופן שיטתי: אין נוהל, אין זמן במערכת, אין הכשרה, כל מורה לפי האופי שלה. "תומכת" בשבילי זה: שהמנהל עומד מאחוריי מול הורה, ושהוא נותן לי מרחב לעבוד עם ההורים בלי לעבור דרכו, ושהוא שואל אותי מה אני צריכה. "לא תומכת" זה כשההנהלה רואה בקשר עם הורים סיכון, ומעדיפה שהמורים יעשו כמה שפחות. המנהל שלנו באמצע: תומך כשיש בעיה, פחות בונה כשאין.</w:t>
       </w:r>
     </w:p>
     <w:p>
@@ -2503,7 +2503,7 @@
           <w:szCs w:val="24"/>
           <w:rtl/>
         </w:rPr>
-        <w:t xml:space="preserve">הכי קשה לי זה האלימות של השכונה שנכנסת לבית הספר דרך ההורים. לא אלימות פיזית, אלא אווירה: הורים שמגיעים מאיימים, כי זאת השפה שהם מכירים מהרחוב. הורים שלא סומכים על אף מוסד, ולכן לא על בית הספר. ילדים שמביאים סכסוכי משפחות לכיתה. אני צריך להיות מורה, מגשר, ולפעמים שומר, ואף אחד לא הכשיר אותי לזה. קשה לי גם ההיעדרויות, שהן הסימפטום של כל השאר. וקשה לי חוסר האונים: אני יודע מה ילד צריך, ההורים יודעים, ואין את זה, לא בבית ולא בעירייה. ודבר אישי: הקושי להפריד. אני מלוד, אני פוגש את ההורים בכל מקום, ויש הורים שהם קרובי משפחה של קרובי משפחה שלי, ושיחה על הילד שלהם היא אף פעם לא רק על הילד.</w:t>
+        <w:t xml:space="preserve">הכי קשה לי זה האלימות של השכונה שנכנסת לבית הספר דרך ההורים. לא אלימות פיזית, אלא אווירה: הורים שמגיעים מאיימים, כי זאת השפה שהם מכירים מהרחוב. הורים שלא סומכים על אף מוסד, ולכן לא על בית הספר. ילדים שמביאים סכסוכי משפחות לכיתה. אני צריכה להיות מורה, מגשרת, ולפעמים שומרת, ואף אחד לא הכשיר אותי לזה. קשה לי גם ההיעדרויות, שהן הסימפטום של כל השאר. וקשה לי חוסר האונים: אני יודעת מה ילד צריך, ההורים יודעים, ואין את זה, לא בבית ולא בעירייה. וקשה לי, כאישה, שיש אבות שלא מדברים איתי ישירות, ושאני צריכה את המנהל כדי שיקשיבו לדברים שאני יודעת טוב יותר ממנו. ודבר אישי: הקושי להפריד. אני מלוד, אני פוגשת את ההורים בכל מקום, ויש הורים שהם קרובי משפחה של קרובי משפחה שלי, ושיחה על הילד שלהם היא אף פעם לא רק על הילד.</w:t>
       </w:r>
     </w:p>
     <w:p>
@@ -2563,7 +2563,7 @@
           <w:szCs w:val="24"/>
           <w:rtl/>
         </w:rPr>
-        <w:t xml:space="preserve">עוזר לי הניסיון, חמש עשרה שנים באותו בית ספר, שההורים של היום הם לפעמים התלמידים של פעם. עוזר לי המנהל, כשצריך. עוזרת לי היועצת, ועוזר לי צוות ההורים שלי, שהוא ההמצאה הכי טובה שעשיתי. עוזר לי שאני גבר, אני אגיד את זה בכנות, כי מול אבות בשכונה שלנו זה פותח דלתות שלמורות סגורות, ואני מנסה להשתמש בזה בשביל המורות בשכבה, ולקחת על עצמי את השיחות עם האבות הקשים. הכשרה: כמעט לא. בתואר לא היה כלום על הורים. הייתה השתלמות אחת של משרד החינוך על "שיח עם הורים", שהייתה בעברית, עם דוגמאות מבית ספר בתל אביב, ולא נגעה במה שקורה אצלנו. ליווי, אין. מה שיש זה מורים שעוזרים זה לזה, בחדר המורים, אחרי שיחה קשה.</w:t>
+        <w:t xml:space="preserve">עוזר לי הניסיון, חמש עשרה שנים באותו בית ספר, שההורים של היום הם לפעמים התלמידים של פעם. עוזר לי המנהל, כשצריך. עוזרת לי היועצת, ועוזר לי צוות ההורים שלי, שהוא ההמצאה הכי טובה שעשיתי. עוזרות לי האמהות, אני אגיד את זה בכנות: כאישה, האמהות אצלנו מדברות איתי על דברים שלא יגידו למורה גבר, על הבית, על הבעל, על מה שקורה באמת, ודרך האמהות אני מגיעה למשפחה. ולאבות הקשים אני הולכת עם המנהל, ואני לא רואה בזה כישלון, זה המבנה. הכשרה: כמעט לא. בתואר לא היה כלום על הורים. הייתה השתלמות אחת של משרד החינוך על "שיח עם הורים", שהייתה בעברית, עם דוגמאות מבית ספר בתל אביב, ולא נגעה במה שקורה אצלנו. ליווי, אין. מה שיש זה מורות שעוזרות זו לזו, בחדר המורות, אחרי שיחה קשה.</w:t>
       </w:r>
     </w:p>
     <w:p>
@@ -2623,7 +2623,7 @@
           <w:szCs w:val="24"/>
           <w:rtl/>
         </w:rPr>
-        <w:t xml:space="preserve">ברמת המורה: לראות את ההורה לפני שרואים את הבעיה. טלפון חיובי, היכרות בתחילת השנה, לדעת מי המשפחה. ולא לפחד מהורים, כי הפחד עובר אליהם. ברמת בית הספר: לבנות את הקשר עם ההורים כמערכת ולא כאופי של מורה: זמן במערכת, נוהל, צוות הורים בכל שכבה, הכשרה שמתאימה ללוד. להכניס הורים להחלטות, לא רק לעזרה, כי ההורים יודעים דברים שאנחנו לא. ולתת למורים גב. ברמת העירייה: תקשורת בערבית, זה הבסיס. עובדת סוציאלית בבית הספר במשרה מלאה, כי היום היא יום בשבוע. פעילות להורים בשכונה, קורסים, מרכז, משהו שבו ההורה הוא לא רק "ההורה של". ובעיקר ביטחון: העירייה והמשטרה צריכות להבין שכל עוד יש ירי בשכונה, ההורים עסוקים בלשמור על הילדים בחיים, ולא בלבוא לאסיפת הורים. אי אפשר לדבר על שותפות עם הורים בלי לדבר על מה שקורה ברחוב שלהם.</w:t>
+        <w:t xml:space="preserve">ברמת המורה: לראות את ההורה לפני שרואים את הבעיה. טלפון חיובי, היכרות בתחילת השנה, לדעת מי המשפחה. ולא לפחד מהורים, כי הפחד עובר אליהם. ברמת בית הספר: לבנות את הקשר עם ההורים כמערכת ולא כאופי של מורה: זמן במערכת, נוהל, צוות הורים בכל שכבה, הכשרה שמתאימה ללוד. להכניס הורים להחלטות, לא רק לעזרה, כי ההורים יודעים דברים שאנחנו לא. ולתת למורות גב, ובמיוחד מול אבות שלא רואים אותן. ברמת העירייה: תקשורת בערבית, זה הבסיס. עובדת סוציאלית בבית הספר במשרה מלאה, כי היום היא יום בשבוע. פעילות להורים בשכונה, קורסים, מרכז, משהו שבו ההורה הוא לא רק "ההורה של". ובעיקר ביטחון: העירייה והמשטרה צריכות להבין שכל עוד יש ירי בשכונה, ההורים עסוקים בלשמור על הילדים בחיים, ולא בלבוא לאסיפת הורים. אי אפשר לדבר על שותפות עם הורים בלי לדבר על מה שקורה ברחוב שלהם.</w:t>
       </w:r>
     </w:p>
     <w:p>
@@ -2683,7 +2683,7 @@
           <w:szCs w:val="24"/>
           <w:rtl/>
         </w:rPr>
-        <w:t xml:space="preserve">המסר שלי: אל תמדדו את ההורים בלוד לפי אסיפות. תמדדו אותם לפי מה הם עושים כשמישהו מבית הספר דופק להם על הדלת. בשלוש עשרה שנים לא פגשתי הורה אחד שלא רצה את הטוב של הילד שלו. פגשתי הרבה הורים שלא ידעו איך, ולא היה להם עם מה, ושאף אחד לא שאל אותם. ולמחקר שלך: תכתבי משהו על המורים. אנחנו בלוד עושים עבודה של מורה, יועץ, עובד סוציאלי ומגשר, במשכורת של מורה ובהכשרה של מורה. אם רוצים שותפות עם ההורים, צריך קודם להחליט שמי שבונה אותה הוא לא לבד.</w:t>
+        <w:t xml:space="preserve">המסר שלי: אל תמדדו את ההורים בלוד לפי אסיפות. תמדדו אותם לפי מה הם עושים כשמישהי מבית הספר דופקת להם על הדלת. בחמש עשרה שנים לא פגשתי הורה אחד שלא רצה את הטוב של הילד שלו. פגשתי הרבה הורים שלא ידעו איך, ולא היה להם עם מה, ושאף אחד לא שאל אותם. ולמחקר שלך: תכתבי משהו על המורות. אנחנו בלוד עושות עבודה של מורה, יועצת, עובדת סוציאלית ומגשרת, במשכורת של מורה ובהכשרה של מורה. אם רוצים שותפות עם ההורים, צריך קודם להחליט שמי שבונה אותה היא לא לבד.</w:t>
       </w:r>
     </w:p>
     <w:p>
@@ -2736,24 +2736,24 @@
           <w:szCs w:val="24"/>
           <w:rtl/>
         </w:rPr>
-        <w:t xml:space="preserve">מגדר: גבר</w:t>
-      </w:r>
-    </w:p>
-    <w:p>
-      <w:pPr>
-        <w:bidi/>
-        <w:spacing w:after="120" w:line="360" w:lineRule="auto"/>
-        <w:jc w:val="both"/>
-      </w:pPr>
-      <w:r>
-        <w:rPr>
-          <w:noProof/>
-          <w:rFonts w:ascii="David" w:cs="David" w:eastAsia="David" w:hAnsi="David"/>
-          <w:sz w:val="24"/>
-          <w:szCs w:val="24"/>
-          <w:rtl/>
-        </w:rPr>
-        <w:t xml:space="preserve">השכלה ותחום הכשרה: הנדסאי, תואר ראשון בהוראת מתמטיקה</w:t>
+        <w:t xml:space="preserve">מגדר: אישה</w:t>
+      </w:r>
+    </w:p>
+    <w:p>
+      <w:pPr>
+        <w:bidi/>
+        <w:spacing w:after="120" w:line="360" w:lineRule="auto"/>
+        <w:jc w:val="both"/>
+      </w:pPr>
+      <w:r>
+        <w:rPr>
+          <w:noProof/>
+          <w:rFonts w:ascii="David" w:cs="David" w:eastAsia="David" w:hAnsi="David"/>
+          <w:sz w:val="24"/>
+          <w:szCs w:val="24"/>
+          <w:rtl/>
+        </w:rPr>
+        <w:t xml:space="preserve">השכלה ותחום הכשרה: הנדסאית, תואר ראשון בהוראת מתמטיקה</w:t>
       </w:r>
     </w:p>
     <w:p>
@@ -2804,7 +2804,7 @@
           <w:szCs w:val="24"/>
           <w:rtl/>
         </w:rPr>
-        <w:t xml:space="preserve">תפקיד בבית הספר: מורה למתמטיקה ורכז שכבת ו'</w:t>
+        <w:t xml:space="preserve">תפקיד בבית הספר: מורה למתמטיקה ורכזת שכבת ו'</w:t>
       </w:r>
     </w:p>
     <w:p>
@@ -7061,7 +7061,7 @@
           <w:szCs w:val="28"/>
           <w:rtl/>
         </w:rPr>
-        <w:t xml:space="preserve">ראיון 6: אחמד (שם בדוי), בית הספר אל-יסמין (לוד)</w:t>
+        <w:t xml:space="preserve">ראיון 6: רנא (שם בדוי), בית הספר אל-יסמין (לוד)</w:t>
       </w:r>
     </w:p>
     <w:p>
@@ -7174,7 +7174,7 @@
           <w:szCs w:val="24"/>
           <w:rtl/>
         </w:rPr>
-        <w:t xml:space="preserve">אני בן שלושים ושלוש, מורה לחינוך גופני ומחנך כיתה ג' באל-יסמין. אני מלוד, גדלתי בשכונה אחרת, ושיחקתי כדורגל בקבוצת הנוער של העיר, עד שנפצעתי. למדתי תואר ראשון בחינוך גופני במכללה, והתחלתי ללמד לפני שמונה שנים בבית ספר בבאר שבע, כי שם היה מקום, ואחרי שנתיים חזרתי ללוד, כי רציתי להיות בבית. באל-יסמין אני שש שנים, ולפני שלוש שנים המנהל ביקש ממני להיות גם מחנך, כי חסרו מחנכים גברים ביסודי, והוא חשב שאני יכול להגיע לאבות ולבנים שמורות לא מגיעות אליהם. הסכמתי, ולא ידעתי לְמה אני נכנס. היום אני מחנך כיתה ג' ומלמד חינוך גופני בכל בית הספר, ואני גם מאמן קבוצת כדורגל של בית הספר אחרי הצהריים, שהיא הדרך שלי להגיע לילדים ולהורים.</w:t>
+        <w:t xml:space="preserve">אני בת שלושים ושלוש, מורה לחינוך גופני ומחנכת כיתה ג' באל-יסמין. אני מלוד, גדלתי בשכונה אחרת, ושיחקתי כדורסל בקבוצת הבנות של העיר עד גיל שמונה עשרה, שזה לא היה מובן מאליו למשפחה שלי. למדתי תואר ראשון בחינוך גופני במכללה, והתחלתי ללמד לפני שמונה שנים בבית ספר בבאר שבע, כי שם היה מקום, ואחרי שנתיים חזרתי ללוד, כי רציתי להיות בבית. באל-יסמין אני שש שנים, ולפני שלוש שנים המנהל ביקש ממני להיות גם מחנכת, כי הוא ראה שהילדים והאמהות מתחברים אליי דרך הספורט. הסכמתי, ולא ידעתי לְמה אני נכנסת. היום אני מחנכת כיתה ג' ומלמדת חינוך גופני בכל בית הספר, ואני גם מאמנת את קבוצת הכדורסל של הבנות ואת קבוצת הכדורגל של הבנים אחרי הצהריים, שהן הדרך שלי להגיע לילדים ולהורים.</w:t>
       </w:r>
     </w:p>
     <w:p>
@@ -7246,7 +7246,7 @@
           <w:szCs w:val="24"/>
           <w:rtl/>
         </w:rPr>
-        <w:t xml:space="preserve">בית הספר הוא יסודי, בשכונה ערבית ותיקה בלוד, ואני מכיר את השכונה הזאת מהכדורגל, כי חצי מהחברים שלי מהקבוצה גדלו בה. ההורים הם משפחות עובדות, רובן גדולות, חלקן במצוקה קשה, ויש גם משפחות שמסתדרות. מה שאני רואה כמחנך גבר, ושמורות אולי רואות פחות: האבות. האבות אצלנו עובדים קשה, הרבה מהם בעבודות פיזיות, חוזרים מאוחר, ובית הספר בשבילם הוא עניין של האמא. בכיתה ג' שלי יש שלושים ילדים, ובפגישות ההורים של השנה הראשונה שלי פגשתי עשרים אמהות ושני אבות. ויש משהו שמאפיין את המשפחות של הילדים שלי: הן גרות בצפיפות, ילדים משחקים ברחוב, ואין להם מקום בטוח, ולכן המגרש של בית הספר הוא בשבילם הדבר הכי חשוב, יותר מהכיתה. ויש אלימות, ברחוב ולפעמים בבית, שאני רואה אותה בחינוך גופני לפני שרואים אותה בכיתה, כי ילד שמכים אותו מתכווץ כשמתקרבים אליו.</w:t>
+        <w:t xml:space="preserve">בית הספר הוא יסודי, בשכונה ערבית ותיקה בלוד, ואני מכירה את השכונה הזאת מהספורט, כי חצי מהחברות שלי מהקבוצה גדלו בה. ההורים הם משפחות עובדות, רובן גדולות, חלקן במצוקה קשה, ויש גם משפחות שמסתדרות. מה שאני רואה כמורה לספורט, ושמורות אחרות אולי רואות פחות: הגוף של הילדים. ילד שלא אוכל, ילד שלא ישן, ילד שמכים אותו, את כל זה רואים במגרש לפני שרואים בכיתה. ומה שאני רואה כמחנכת: בכיתה ג' שלי יש שלושים ילדים, ובפגישות ההורים של השנה הראשונה שלי פגשתי עשרים אמהות ושני אבות. ויש משהו שמאפיין את המשפחות של הילדים שלי: הן גרות בצפיפות, ילדים משחקים ברחוב, ואין להם מקום בטוח, ולכן המגרש של בית הספר הוא בשבילם הדבר הכי חשוב, יותר מהכיתה. ולבנות אין בכלל מקום לשחק בו בשכונה, ולכן קבוצת הכדורסל שלי היא בשבילן הדבר היחיד.</w:t>
       </w:r>
     </w:p>
     <w:p>
@@ -7306,7 +7306,7 @@
           <w:szCs w:val="24"/>
           <w:rtl/>
         </w:rPr>
-        <w:t xml:space="preserve">אני אגיד את האמת: כמורה לחינוך גופני, בשנים הראשונות, לא היה לי כמעט קשר עם הורים, וזה היה נוח. כמחנך, הקשר עם ההורים נהיה העבודה הכי קשה והכי חשובה. המשמעות בשבילי היא בעיקר אחת: לדעת. ילד בכיתה ג' לא יספר לי מה קורה בבית, אבל הגוף שלו מספר, והאמא יכולה להסביר. ויש משמעות שנייה, שקשורה לזה שאני גבר: אני מרגיש שהתפקיד שלי הוא להביא את האבות. ילד שרואה שהאבא שלו בא לבית הספר, מדבר עם המחנך, בא למשחק, זה ילד שבית הספר נהיה חשוב בשבילו. ומשמעות שלישית, שלמדתי מהכדורגל: קבוצה שההורים שלה מגיעים למשחקים מנצחת יותר. זה לא מחקר, זה מה שראיתי. אז אני מנסה להפוך את הכיתה לקבוצה שההורים מגיעים למשחקים שלה.</w:t>
+        <w:t xml:space="preserve">אני אגיד את האמת: כמורה לחינוך גופני, בשנים הראשונות, לא היה לי כמעט קשר עם הורים, וזה היה נוח. כמחנכת, הקשר עם ההורים נהיה העבודה הכי קשה והכי חשובה. המשמעות בשבילי היא בעיקר אחת: לדעת. ילד בכיתה ג' לא יספר לי מה קורה בבית, אבל הגוף שלו מספר, והאמא יכולה להסביר. ויש משמעות שנייה, שקשורה לספורט: אני מרגישה שהתפקיד שלי הוא להביא את ההורים לראות את הילד שלהם מצליח במשהו. ילד שההורים שלו ראו אותו במשחק, מחאו לו כפיים, זה ילד שבית הספר נהיה חשוב בשבילו. ומשמעות שלישית, שלמדתי מהכדורסל: קבוצה שההורים שלה מגיעים למשחקים מנצחת יותר. זה לא מחקר, זה מה שראיתי. אז אני מנסה להפוך את הכיתה לקבוצה שההורים מגיעים למשחקים שלה. ויש משמעות רביעית, שקשורה לבנות: כשאמא רואה את הבת שלה משחקת, משהו משתנה במה שהיא חושבת שמותר לבת.</w:t>
       </w:r>
     </w:p>
     <w:p>
@@ -7397,7 +7397,7 @@
           <w:szCs w:val="24"/>
           <w:rtl/>
         </w:rPr>
-        <w:t xml:space="preserve">בתור מחנך: קבוצת ווטסאפ של הכיתה, הודעות אישיות, והרבה טלפונים, בעיקר אחר הצהריים, כי בבוקר ההורים עובדים. משו"ב, אני מעדכן, ובכיתה ג' ההורים לא פותחים. אסיפות הורים. פגישות אישיות. ובתור מורה לחינוך גופני ומאמן יש לי ערוץ שאין למורות: המגרש. אחרי הצהריים, באימון, אבות באים לאסוף את הילדים, ועומדים ליד הגדר, ומדברים איתי. יש אבות שדיברתי איתם עשרות פעמים ליד הגדר ואף פעם לא בחדר. ועשינו משהו השנה: "יום ספורט משפחות", שבו ההורים משחקים עם הילדים, ובאו ארבעים הורים, מהם עשרים וחמישה אבות, שזה יותר אבות מכל אסיפות ההורים של בית הספר ביחד. מה שעובד הכי טוב: הגדר והמגרש. אבא לא יבוא לפגישה, אבל הוא ידבר איתי ליד הגדר על הבן שלו עשרים דקות, בלי שהוא ירגיש שזה "פגישה". ווטסאפ טוב להודעות, טלפון לאמהות, והגדר לאבות.</w:t>
+        <w:t xml:space="preserve">בתור מחנכת: קבוצת ווטסאפ של הכיתה, הודעות אישיות, והרבה טלפונים, בעיקר אחר הצהריים, כי בבוקר ההורים עובדים. משו"ב, אני מעדכנת, ובכיתה ג' ההורים לא פותחים. אסיפות הורים. פגישות אישיות. ובתור מורה לחינוך גופני ומאמנת יש לי ערוץ שאין למורות אחרות: המגרש. אחרי הצהריים, באימון, ההורים באים לאסוף את הילדים, ועומדים ליד הגדר, ומדברים איתי. האמהות באות לאימוני הבנות, והאבות באים לאימוני הבנים, ויש אבות שדיברתי איתם עשרות פעמים ליד הגדר ואף פעם לא בחדר. ועשינו משהו השנה: "יום ספורט משפחות", שבו ההורים משחקים עם הילדים, ובאו ארבעים הורים, מהם עשרים וחמישה אבות, שזה יותר אבות מכל אסיפות ההורים של בית הספר ביחד. מה שעובד הכי טוב: הגדר והמגרש. הורה לא יבוא לפגישה, אבל ידבר איתי ליד הגדר על הילד שלו עשרים דקות, בלי שירגיש שזה "פגישה". ווטסאפ טוב להודעות, טלפון לאמהות, והגדר לכולם.</w:t>
       </w:r>
     </w:p>
     <w:p>
@@ -7457,7 +7457,7 @@
           <w:szCs w:val="24"/>
           <w:rtl/>
         </w:rPr>
-        <w:t xml:space="preserve">אני יוזם, ברוב המקרים. ההורים פונים אליי בעיקר על מריבות בין ילדים, על פציעות קטנות בחינוך גופני, ועל הכדורגל: "למה הבן שלי לא בהרכב". ולפעמים האמהות פונות על דברים שהן לא יספרו למורה אחרת: "הוא לא רוצה ללכת לבית הספר", "הוא מפחד", ואני חושב שהן מספרות לי כי אני "המורה של הספורט", לא "המורה של הציונים", ואיתי זה פחות מביך. אני פונה להורים על התנהגות, על היעדרויות, על ילדים שאני רואה שמשהו קורה להם. ואני פונה לאבות, בכוונה, דרך הכדורגל: "הבן שלך כבש היום", ואז, אחרי כמה טלפונים כאלה, "אני צריך לדבר איתך על משהו". למדתי שאבא שקיבל ממני שלושה טלפונים על כדורגל עונה לטלפון הרביעי על בעיה. אבא שהטלפון הראשון שלו ממני הוא על בעיה, לא עונה בכלל.</w:t>
+        <w:t xml:space="preserve">אני יוזמת, ברוב המקרים. ההורים פונים אליי בעיקר על מריבות בין ילדים, על פציעות קטנות בחינוך גופני, ועל הקבוצות: "למה הבן שלי לא בהרכב", "למה הבת שלי צריכה להישאר אחרי הצהריים". ולפעמים האמהות פונות על דברים שהן לא יספרו למורה אחרת: "הוא לא רוצה ללכת לבית הספר", "היא מפחדת", ואני חושבת שהן מספרות לי כי אני "המורה של הספורט", לא "המורה של הציונים", ואיתי זה פחות מביך. אני פונה להורים על התנהגות, על היעדרויות, על ילדים שאני רואה שמשהו קורה להם. ואני פונה לאבות, בכוונה, דרך הכדורגל: "הבן שלך כבש היום", ואז, אחרי כמה טלפונים כאלה, "אני צריכה לדבר איתך על משהו". למדתי שאבא שקיבל ממני שלושה טלפונים על כדורגל עונה לטלפון הרביעי על בעיה. אבא שהטלפון הראשון שלו ממני הוא על בעיה, לא עונה בכלל. ולאמהות אני פונה דרך הבנות: "הבת שלך קלעה היום", וזה טלפון שהאמא מספרת עליו לכל המשפחה.</w:t>
       </w:r>
     </w:p>
     <w:p>
@@ -7529,7 +7529,7 @@
           <w:szCs w:val="24"/>
           <w:rtl/>
         </w:rPr>
-        <w:t xml:space="preserve">השיחה שהכי השפיעה עליי הייתה עם אבא של ילד שראיתי אצלו סימנים על הגב בשיעור חינוך גופני. דיווחתי, כמו שצריך, ליועצת, ואחר כך ביקשתי לדבר עם האבא בעצמי, למרות שהיועצת אמרה שאולי עדיף שלא. הזמנתי אותו למגרש, לא למשרד. הוא בא, מתגונן, ואמר שהילד נפל. לא התווכחתי. דיברתי איתו על הילד, על זה שהוא שחקן טוב, על זה שהוא מפחד כשמישהו מתקרב אליו, ואמרתי לו שאני לא יודע מה קרה, אבל שאני רואה ילד מפוחד, ושאני רוצה שהוא יידע שבית הספר רואה. הוא שתק הרבה זמן. ואז אמר שהוא לא ישן, שהוא איבד את העבודה, ושהוא "לא שולט". הפניתי אותו, דרך היועצת, לטיפול, והוא הלך. הילד היום בכיתה ו', והאבא בא למשחקים. לפני השיחה הרגשתי כעס ורצון להגן על הילד מהאבא. אחרי השיחה הבנתי שלהגן על הילד זה גם לעזור לאבא. וזה לא תמיד נכון, יש מקרים שצריך להרחיק, אבל במקרה הזה זה היה נכון.</w:t>
+        <w:t xml:space="preserve">השיחה שהכי השפיעה עליי הייתה עם אמא של ילד שראיתי אצלו סימנים על הגב בשיעור חינוך גופני. דיווחתי, כמו שצריך, ליועצת, ואחר כך ביקשתי לדבר עם האמא בעצמי, למרות שהיועצת אמרה שאולי עדיף שלא. הזמנתי אותה למגרש, לא למשרד, אחרי אימון. היא באה, מתגוננת, ואמרה שהילד נפל. לא התווכחתי. דיברתי איתה על הילד, על זה שהוא שחקן טוב, על זה שהוא מפחד כשמישהו מתקרב אליו, ואמרתי לה שאני לא יודעת מה קרה, אבל שאני רואה ילד מפוחד, ושאני רוצה שהיא תדע שבית הספר רואה. היא שתקה הרבה זמן. ואז אמרה שהבעל שלה איבד את העבודה, שהוא לא ישן, ושהוא "לא שולט", ושהיא מפחדת ממנו ובשביל הילדים. הפניתי אותה, דרך היועצת, לעזרה, והיא הלכה, ובעלה אחריה. הילד היום בכיתה ו', והאבא בא למשחקים. לפני השיחה הרגשתי כעס ורצון להגן על הילד מהמשפחה. אחרי השיחה הבנתי שלהגן על הילד זה גם לעזור לאמא, שהייתה לבד עם הפחד שלה. וזה לא תמיד נכון, יש מקרים שצריך להרחיק, אבל במקרה הזה זה היה נכון.</w:t>
       </w:r>
     </w:p>
     <w:p>
@@ -7601,7 +7601,7 @@
           <w:szCs w:val="24"/>
           <w:rtl/>
         </w:rPr>
-        <w:t xml:space="preserve">הכלים הדיגיטליים, מבחינתי, הם כלי לאמהות ולא לאבות. קבוצת הווטסאפ של הכיתה היא קבוצה של אמהות, גם אם האבות בה. האבות לא כותבים, לא קוראים, והקבוצה לא מגיעה אליהם. המידע עובר, ההורים יודעים הכול, וזה טוב. אבל הקשר עם ההורים שהכי צריך אותם, האבות, הדיגיטלי לא נגע בו. ויש משהו שהדיגיטלי עשה לרעה: הפך כל דבר למיידי. אמא שהילד שלה חזר עם שריטה כותבת לי בשתיים וחצי, ואם לא עניתי עד שלוש, זה כבר "המחנך לא מתייחס". פנים אל פנים לעומת הודעות: אני מאמן, ואני יודע ששחקן שאתה מדבר איתו בפנים שומע, ושחקן שאתה שולח לו הודעה קורא. אותו דבר הורים. בפנים אני יכול להגיד לאבא דבר קשה והוא יקבל, כי הוא רואה שאכפת לי. בהודעה אותו דבר הוא עלבון. אני שולח הודעות על עובדות, ומדבר בפנים על כל מה שיש בו רגש.</w:t>
+        <w:t xml:space="preserve">הכלים הדיגיטליים, מבחינתי, הם כלי לאמהות ולא לאבות. קבוצת הווטסאפ של הכיתה היא קבוצה של אמהות, גם אם האבות בה. האבות לא כותבים, לא קוראים, והקבוצה לא מגיעה אליהם. המידע עובר, ההורים יודעים הכול, וזה טוב. אבל הקשר עם ההורים שהכי צריך אותם, הדיגיטלי לא נגע בו. ויש משהו שהדיגיטלי עשה לרעה: הפך כל דבר למיידי. אמא שהילד שלה חזר עם שריטה כותבת לי בשתיים וחצי, ואם לא עניתי עד שלוש, זה כבר "המחנכת לא מתייחסת". פנים אל פנים לעומת הודעות: אני מאמנת, ואני יודעת ששחקנית שאת מדברת איתה בפנים שומעת, ושחקנית שאת שולחת לה הודעה קוראת. אותו דבר הורים. בפנים אני יכולה להגיד לאמא דבר קשה והיא תקבל, כי היא רואה שאכפת לי. בהודעה אותו דבר הוא עלבון. אני שולחת הודעות על עובדות, ומדברת בפנים על כל מה שיש בו רגש.</w:t>
       </w:r>
     </w:p>
     <w:p>
@@ -7673,7 +7673,7 @@
           <w:szCs w:val="24"/>
           <w:rtl/>
         </w:rPr>
-        <w:t xml:space="preserve">בבית הספר שלנו ההורים ערבים, והגיוון שאני פוגש הוא בתוך הקהילה: בדואים, לודאים, כפריים, ובכדורגל אני רואה את זה טוב, כי יש הורים שלא רוצים שהבן ישחק עם ילדים ממשפחה מסוימת, בגלל סכסוכים. ואת הגיוון של לוד אני פוגש דרך הספורט: הקבוצה שלנו משחקת נגד קבוצות של בתי ספר יהודיים בעיר, ואחרי מאי 2021 היו הורים שלא רצו שהילדים ייסעו, ואחרים שרצו דווקא כן, "שיראו אותם". המשחקים האלה הם בשבילי הדבר הכי טוב שקרה לקשר בין הילדים שלנו לעיר, וגם הכי מתוח. פער שפה: המערכת בעברית, ואני מתרגם, כמו כולם. פער תרבות: אמא שלא רצתה שהבת שלה תשתתף בחינוך גופני עם בנים, בכיתה ג', ואני בהתחלה לא הבנתי, ואז הבנתי שהבעיה היא לא הספורט אלא הבגדים, ופתרנו את זה עם מכנסיים ארוכים. למדתי שרוב הפערים התרבותיים הם פערים של פרט קטן, ואם שואלים, מוצאים את הפרט.</w:t>
+        <w:t xml:space="preserve">בבית הספר שלנו ההורים ערבים, והגיוון שאני פוגשת הוא בתוך הקהילה: בדואים, לודאים, כפריים, ובספורט אני רואה את זה טוב, כי יש הורים שלא רוצים שהבן ישחק עם ילדים ממשפחה מסוימת, בגלל סכסוכים, ויש הבדל גדול בין המשפחות במה מותר לבת: יש אמהות ששולחות את הבת לכדורסל בשמחה, ויש משפחות שבשבילן בת במכנסיים על מגרש זה דבר שלא יקרה. ואת הגיוון של לוד אני פוגשת דרך הספורט: הקבוצות שלנו משחקות נגד קבוצות של בתי ספר יהודיים בעיר, ואחרי מאי 2021 היו הורים שלא רצו שהילדים ייסעו, ואחרים שרצו דווקא כן, "שיראו אותם". המשחקים האלה הם בשבילי הדבר הכי טוב שקרה לקשר בין הילדים שלנו לעיר, וגם הכי מתוח. פער שפה: המערכת בעברית, ואני מתרגמת, כמו כולן. פער תרבות: אמא שלא רצתה שהבת שלה תשתתף בחינוך גופני עם בנים, בכיתה ג', ואני בהתחלה לא הבנתי, ואז הבנתי שהבעיה היא לא הספורט אלא הבגדים, ופתרנו את זה עם מכנסיים ארוכים. ובקבוצת הבנות, אבא שלא הסכים שהבת תיסע למשחק חוץ, ופתרנו בכך שהאמא נוסעת כמלווה. למדתי שרוב הפערים התרבותיים הם פערים של פרט קטן, ואם שואלים, מוצאים את הפרט.</w:t>
       </w:r>
     </w:p>
     <w:p>
@@ -7764,7 +7764,7 @@
           <w:szCs w:val="24"/>
           <w:rtl/>
         </w:rPr>
-        <w:t xml:space="preserve">ההורים שותפים בעיקר בטקסים, בטיולים, ובכדורגל: יש לי אבות שמסיעים את הקבוצה למשחקים, ואבא אחד שהוא מאמן עוזר בהתנדבות. יש ועד הורים כיתתי של שתי אמהות, ויש ועד בית ספרי. בהחלטות: בכיתה שלי, קצת. אני שואל את ההורים בתחילת השנה מה הם רוצים שהכיתה תעשה השנה, טיול, פרויקט, ומצביעים. ברמת בית הספר, לא, ההחלטות אצל המנהל. ואני רוצה להגיד משהו על האבות: בכדורגל, האבות שותפים בהחלטות הרבה יותר מאשר בכיתה. הם מחליטים איתי על משחקים, על הסעות, על כסף לחולצות. והם עושים את זה בשמחה, כי זה תחום שהם מרגישים שהם מבינים בו. אני חושב שזה הסוד: ההורים שותפים בהחלטות כשהם מרגישים שיש להם מה לתרום. בתוכנית הלימודים הם לא מרגישים ככה. בכדורגל כן.</w:t>
+        <w:t xml:space="preserve">ההורים שותפים בעיקר בטקסים, בטיולים, ובקבוצות: יש לי אבות שמסיעים את קבוצת הבנים למשחקים, אמהות שמלוות את הבנות, ואמא אחת, שהייתה שחקנית בצעירותה, שהיא מאמנת עוזרת בהתנדבות. יש ועד הורים כיתתי של שתי אמהות, ויש ועד בית ספרי. בהחלטות: בכיתה שלי, קצת. אני שואלת את ההורים בתחילת השנה מה הם רוצים שהכיתה תעשה השנה, טיול, פרויקט, ומצביעים. ברמת בית הספר, לא, ההחלטות אצל המנהל. ואני רוצה להגיד משהו על הספורט: בקבוצות, ההורים שותפים בהחלטות הרבה יותר מאשר בכיתה. הם מחליטים איתי על משחקים, על הסעות, על כסף לחולצות, ועל השאלה אם הבנות נוסעות למשחקי חוץ, שזאת החלטה שלא יכולה להתקבל בלי האמהות. והם עושים את זה בשמחה, כי זה תחום שהם מרגישים שהם מבינים בו. אני חושבת שזה הסוד: ההורים שותפים בהחלטות כשהם מרגישים שיש להם מה לתרום. בתוכנית הלימודים הם לא מרגישים ככה. בספורט כן.</w:t>
       </w:r>
     </w:p>
     <w:p>
@@ -7824,7 +7824,7 @@
           <w:szCs w:val="24"/>
           <w:rtl/>
         </w:rPr>
-        <w:t xml:space="preserve">המקרה שהכי הצליח לי הוא יום ספורט המשפחות, שסיפרתי עליו. אבל אני רוצה לספר על משהו קטן יותר שהצליח יותר: ילד בכיתה שלי, עם בעיות התנהגות קשות, שהאבא שלו לא ענה לשום פנייה מבית הספר שנתיים. צירפתי את הילד לקבוצת הכדורגל, בלי תנאים. אחרי שבועיים האבא בא לאסוף אותו מהאימון, ועמד ליד הגדר. דיברנו על הקבוצה. בשבוע שאחרי הוא בא שוב. אחרי חודש אמרתי לו שהבן שלו שחקן טוב אבל שהוא מתפרץ, ושאלתי אם זה קורה גם בבית. הוא אמר שכן. ואז דיברנו, ליד הגדר, על מה אפשר לעשות, והוא בא לפגישה עם היועצת, הראשונה שלו אי פעם בבית הספר. הילד היום עדיין קשה, אבל יש לו אבא שעונה. מה שגרם להצלחה: שלא ביקשתי מהאבא כלום בהתחלה, רק נתתי לבן שלו מקום. שהמקום היה המגרש ולא המשרד. ושהשיחה הראשונה הייתה על מה שהילד טוב בו, והשנייה על מה שקשה.</w:t>
+        <w:t xml:space="preserve">המקרה שהכי הצליח לי הוא יום ספורט המשפחות, שסיפרתי עליו. אבל אני רוצה לספר על משהו קטן יותר שהצליח יותר: קבוצת הכדורסל של הבנות. כשהקמתי אותה, לפני ארבע שנים, נרשמו שש בנות, ואמהות אמרו לי "מה הבת שלי צריכה את זה". ביקשתי מהאמהות לבוא לאימון הראשון, רק לראות. באו שלוש. באימון הבא, שבע. אחרי חודש האמהות ישבו על הספסל כל אימון, ומדברות ביניהן, ומדברות איתי, על הבנות, על הבית, על הכול. היום בקבוצה עשרים ושתיים בנות, ולאימונים יש "ספסל אמהות" קבוע, שהפך למקום שבו אני עושה את רוב העבודה שלי כמחנכת, גם על ילדים שלא בקבוצה. ואמא אחת, שהבת שלה הייתה הראשונה שנרשמה, היא היום מאמנת עוזרת. מה שגרם להצלחה: שלא ביקשתי מהאמהות כלום בהתחלה, רק להסתכל. שהמקום היה המגרש ולא המשרד. ושהאמהות ראו את הבנות שלהן חזקות, וזה שינה אותן, לא רק את הבנות.</w:t>
       </w:r>
     </w:p>
     <w:p>
@@ -7896,7 +7896,7 @@
           <w:szCs w:val="24"/>
           <w:rtl/>
         </w:rPr>
-        <w:t xml:space="preserve">המקרה הקשה שלי היה פציעה. ילד נפצע בשיעור חינוך גופני, שבר ביד, תאונה רגילה, והאמא באה לבית הספר למחרת עם שני אחים שלה, ואיימה עליי שהיא "תסגור לי את בית הספר". הרגשתי מאוים, ופגוע, כי אני דווקא המורה שהכי שומר על הילדים. והרגשתי שאני מוותר על ההוראה, באותו יום חשבתי לעזוב. המנהל יצא לדבר איתם, ואני לא. אחרי שבוע, כשהיד הייתה בגבס והילד חזר, ביקשתי מהאמא שתבוא, לבד, ודיברנו. היא בכתה ואמרה שהיא פחדה, שבעלה עבד בחוץ לארץ ושהיא לבד עם הילדים, ושכשהיא ראתה את היד היא חשבה שמשהו נורא קרה. לא התנצלתי על הפציעה, כי לא הייתי אשם, אבל אמרתי לה שאני מבין את הפחד. היא התנצלה על האחים. מה שלמדתי: שאיום של הורה הוא כמעט תמיד פחד, ושהדרך היחידה לפרק פחד היא בשקט, אחרי כמה ימים, אחד על אחד. ולמדתי שבלוד הורים באים עם אחים כי הם לא מאמינים שמישהו יקשיב להם לבד. ואם מקשיבים, הם באים לבד בפעם הבאה.</w:t>
+        <w:t xml:space="preserve">המקרה הקשה שלי היה פציעה. ילד נפצע בשיעור חינוך גופני, שבר ביד, תאונה רגילה, והאמא באה לבית הספר למחרת עם שני אחים שלה, ואיימה עליי, מול הילדים ומול הורים אחרים, שהיא "תסגור לי את בית הספר", ואחד האחים אמר שאישה לא צריכה ללמד ספורט בכלל. הרגשתי מאוימת, ופגועה, כי אני דווקא המורה שהכי שומרת על הילדים, ובאותו יום חשבתי לעזוב. המנהל יצא לדבר איתם, ואני לא. אחרי שבוע, כשהיד הייתה בגבס והילד חזר, ביקשתי מהאמא שתבוא, לבד, ודיברנו. היא בכתה ואמרה שהיא פחדה, שבעלה עובד בחוץ לארץ ושהיא לבד עם הילדים, ושכשהיא ראתה את היד היא חשבה שמשהו נורא קרה, ושהאחים באו כי היא ביקשה. לא התנצלתי על הפציעה, כי לא הייתי אשמה, אבל אמרתי לה שאני מבינה את הפחד. היא התנצלה על האחים. מה שלמדתי: שאיום של הורה הוא כמעט תמיד פחד, ושהדרך היחידה לפרק פחד היא בשקט, אחרי כמה ימים, אחת על אחת. ולמדתי שבלוד אמהות באות עם אחים כי הן לא מאמינות שמישהו יקשיב להן לבד. ואם מקשיבים, הן באות לבד בפעם הבאה.</w:t>
       </w:r>
     </w:p>
     <w:p>
@@ -7956,7 +7956,7 @@
           <w:szCs w:val="24"/>
           <w:rtl/>
         </w:rPr>
-        <w:t xml:space="preserve">ההבדל ברור, ואצלי הוא מתחלק לפי מגדר: האמהות מעורבות, האבות לא, ברוב המשפחות. ויש משפחות שבהן אף אחד לא מעורב, ואלה בדרך כלל המשפחות שהכי קשה להן. אני מגיע לאבות דרך הכדורגל והמגרש, סיפרתי. אני מגיע למשפחות שלא מעורבות בכלל דרך הילד: אני נותן לו תפקיד, קפטן, אחראי ציוד, ואז מתקשר הביתה להגיד שהוא קפטן, וזה טלפון שעונים עליו. ואני מגיע דרך השכונה: אני מלוד, אני מכיר אנשים, ולפעמים אני מבקש מחבר שמכיר את המשפחה להגיד לאבא שהמחנך רוצה לדבר. זה לא כתוב בשום ספר, אבל זה עובד. מה שאני לא עושה: לא שולח מכתבים, לא מזמן "לשיחה", לא מאיים בקצין ביקור סדיר. ההורים הלא מעורבים אצלנו כבר קיבלו מספיק מכתבים מהמערכת, ועוד אחד לא ישנה.</w:t>
+        <w:t xml:space="preserve">ההבדל ברור, ואצלי הוא מתחלק לפי מגדר: האמהות מעורבות, האבות לא, ברוב המשפחות. ויש משפחות שבהן אף אחד לא מעורב, ואלה בדרך כלל המשפחות שהכי קשה להן. אני מגיעה לאבות דרך הכדורגל והגדר, סיפרתי, ולאמהות דרך ספסל האמהות של הכדורסל. אני מגיעה למשפחות שלא מעורבות בכלל דרך הילד: אני נותנת לו תפקיד, קפטן, אחראית ציוד, ואז מתקשרת הביתה להגיד שהוא קפטן, וזה טלפון שעונים עליו. ואני מגיעה דרך השכונה: אני מלוד, אני מכירה אנשים, ולפעמים אני מבקשת מחברה שמכירה את המשפחה להגיד לאמא שהמחנכת רוצה לדבר. זה לא כתוב בשום ספר, אבל זה עובד. מה שאני לא עושה: לא שולחת מכתבים, לא מזמנת "לשיחה", לא מאיימת בקצין ביקור סדיר. ההורים הלא מעורבים אצלנו כבר קיבלו מספיק מכתבים מהמערכת, ועוד אחד לא ישנה.</w:t>
       </w:r>
     </w:p>
     <w:p>
@@ -8028,7 +8028,7 @@
           <w:szCs w:val="24"/>
           <w:rtl/>
         </w:rPr>
-        <w:t xml:space="preserve">המנהל שלנו תומך בי מאוד, ואני חושב שזה כי הוא זה שביקש ממני להיות מחנך, אז הוא רוצה שאצליח. הוא נתן לי את הקבוצה, את המגרש אחרי הצהריים, את יום הספורט, וכשההורים הגיעו עם איומים הוא עמד בחזית. אבל אני רואה שההנהלה תומכת במורים שיוזמים, ופחות בונה משהו שיטתי: אין תוכנית, אין הכשרה, אין שעות לכל מחנך, רק למי שביקש. "תומכת" בשבילי זה שלושה דברים: שהמנהל אומר כן לרעיונות. שהוא מגבה מול הורים. ושהוא לא לוקח את ההורה ממני כשיש בעיה, אלא מחזיר אותו אליי אחרי שהרגיע. "לא תומכת" זה מנהל שפותר הכול בעצמו, ואז המורה לא קיים בעיני ההורים. המנהל שלנו באמצע, הוא נוטה לפתור בעצמו, ואני ביקשתי ממנו להחזיר אליי, והוא למד.</w:t>
+        <w:t xml:space="preserve">המנהל שלנו תומך בי מאוד, ואני חושבת שזה כי הוא זה שביקש ממני להיות מחנכת, אז הוא רוצה שאצליח. הוא נתן לי את הקבוצות, את המגרש אחרי הצהריים, את יום הספורט, וכשההורים הגיעו עם איומים הוא עמד בחזית. אבל אני רואה שההנהלה תומכת במורות שיוזמות, ופחות בונה משהו שיטתי: אין תוכנית, אין הכשרה, אין שעות לכל מחנכת, רק למי שביקשה. "תומכת" בשבילי זה שלושה דברים: שהמנהל אומר כן לרעיונות. שהוא מגבה מול הורים, וגם מול הורים שחושבים שאישה לא צריכה לאמן. ושהוא לא לוקח את ההורה ממני כשיש בעיה, אלא מחזיר אותו אליי אחרי שהרגיע. "לא תומכת" זה מנהל שפותר הכול בעצמו, ואז המורה לא קיימת בעיני ההורים. המנהל שלנו באמצע, הוא נוטה לפתור בעצמו, ואני ביקשתי ממנו להחזיר אליי, והוא למד.</w:t>
       </w:r>
     </w:p>
     <w:p>
@@ -8107,7 +8107,7 @@
           <w:szCs w:val="24"/>
           <w:rtl/>
         </w:rPr>
-        <w:t xml:space="preserve">הכי קשה לי זה להיות מחנך צעיר, גבר, בכיתה ג', מול אמהות. יש אמהות שלא נוח להן לדבר איתי על דברים רגישים, ואני מבין, ואני צריך לעבור דרך היועצת. ויש אמהות שמצפות ממני להיות "קשוח" עם הילדים, כי אני גבר, ואני לא רוצה להיות קשוח, אני רוצה להיות מאמן. קשה לי גם הגבול בין מאמן למחנך: אבא שמדבר איתי ליד הגדר על הכדורגל לא תמיד רוצה שאחר כך אדבר איתו על ההתנהגות של הבן, ואני צריך לבחור מתי. וקשה לי האלימות, שאני רואה אותה בגוף של הילדים לפני כולם, ושאחרי שדיווחתי, אני לא תמיד יודע מה קרה. וקשה לי שאין לי זמן: מחנך, מורה לחינוך גופני לכל בית הספר, מאמן, ואני בן שלושים ושלוש עם שני ילדים קטנים, ואשתי שואלת מתי אני בבית.</w:t>
+        <w:t xml:space="preserve">הכי קשה לי זה להיות מחנכת צעירה, מורה לספורט, בשכונה מסורתית. יש אבות שלא נוח להם שאישה מאמנת את הבן שלהם, ויש משפחות שלא נוח להן שהבת שלהן על מגרש, ואני צריכה לעבוד עם שני הדברים בלי לוותר על אף אחד מהם. ויש אמהות שמצפות ממני להיות "קשוחה" עם הילדים, כי אני מורה לספורט, ואני לא רוצה להיות קשוחה, אני רוצה להיות מאמנת. קשה לי גם הגבול בין מאמנת למחנכת: הורה שמדבר איתי ליד הגדר על הספורט לא תמיד רוצה שאחר כך אדבר איתו על ההתנהגות של הילד, ואני צריכה לבחור מתי. וקשה לי האלימות, שאני רואה אותה בגוף של הילדים לפני כולם, ושאחרי שדיווחתי, אני לא תמיד יודעת מה קרה. וקשה לי שאין לי זמן: מחנכת, מורה לחינוך גופני לכל בית הספר, שתי קבוצות, ואני בת שלושים ושלוש עם שני ילדים קטנים, ובעלי שואל מתי אני בבית.</w:t>
       </w:r>
     </w:p>
     <w:p>
@@ -8167,7 +8167,7 @@
           <w:szCs w:val="24"/>
           <w:rtl/>
         </w:rPr>
-        <w:t xml:space="preserve">מה שהכי עוזר לי זה הכדורגל, שהוא הכלי שלי לכל דבר. עוזר לי המנהל, כמו שאמרתי. עוזרת לי היועצת, שבלעדיה אני לא הייתי מתמודד עם המקרים הקשים. עוזרת לי המחנכת של כיתה ג' השנייה, ותיקה, שלימדה אותי איך לדבר עם אמהות. ועוזר לי שאני מלוד ושיש לי חברים בשכונה. הכשרה: בתואר בחינוך גופני לא היה כלום על הורים, אפילו לא על הורים בספורט. כשנהייתי מחנך, לא קיבלתי שום הכשרה, המנהל אמר "אתה תסתדר". בשנה שעברה הייתה השתלמות בית ספרית על שיח עם הורים, שהייתה טובה, אבל שנתיים אחרי שהתחלתי. ליווי, אין, חוץ מהמחנכת הוותיקה שאני רודף אחריה בהפסקות. הייתי רוצה שמחנך חדש יקבל שנה של ליווי, אחת לשבוע, עם מישהו שעשה את זה.</w:t>
+        <w:t xml:space="preserve">מה שהכי עוזר לי זה הספורט, שהוא הכלי שלי לכל דבר. עוזר לי המנהל, כמו שאמרתי. עוזרת לי היועצת, שבלעדיה אני לא הייתי מתמודדת עם המקרים הקשים. עוזרת לי המחנכת של כיתה ג' השנייה, ותיקה, שלימדה אותי איך לדבר עם אמהות. עוזר לי ספסל האמהות, שהוא בעצם צוות ההורים שלי. ועוזר לי שאני מלוד ושיש לי חברות בשכונה. הכשרה: בתואר בחינוך גופני לא היה כלום על הורים, אפילו לא על הורים בספורט. כשנהייתי מחנכת, לא קיבלתי שום הכשרה, המנהל אמר "את תסתדרי". בשנה שעברה הייתה השתלמות בית ספרית על שיח עם הורים, שהייתה טובה, אבל שנתיים אחרי שהתחלתי. ליווי, אין, חוץ מהמחנכת הוותיקה שאני רודפת אחריה בהפסקות. הייתי רוצה שמחנכת חדשה תקבל שנה של ליווי, אחת לשבוע, עם מישהי שעשתה את זה.</w:t>
       </w:r>
     </w:p>
     <w:p>
@@ -8227,7 +8227,7 @@
           <w:szCs w:val="24"/>
           <w:rtl/>
         </w:rPr>
-        <w:t xml:space="preserve">ברמת המורה: למצוא את הערוץ שעובד להורה, לא את הערוץ שנוח למורה. לאבות, המגרש. לאמהות, הטלפון. לסבתות, הבית. להתחיל מהחיובי. ולתת להורים תפקיד שהם טובים בו. ברמת בית הספר: לבנות דרכים להגיע לאבות, כי היום בית הספר מדבר רק עם האמהות, וזה חצי מההורים. יום ספורט משפחות, קבוצות, אבות מאמנים, מה שהולך. לתת למחנכים הכשרה וליווי. לפתוח את המגרש אחרי הצהריים, כי זה המקום הבטוח היחיד בשכונה. ולהחזיר הורים למחנך אחרי שהמנהל הרגיע. ברמת העירייה: מגרשים. אני יודע שזה נשמע פשוט, אבל בשכונה שלנו אין מגרש ציבורי אחד תקין, והילדים משחקים בכביש, וההורים מפחדים. מגרש מואר בשכונה היה עושה לקשר בין בית הספר, הילדים וההורים יותר מכל תוכנית. ותקשורת בערבית, ועובדת סוציאלית בבית הספר, וביטחון, כמו שכולם אומרים.</w:t>
+        <w:t xml:space="preserve">ברמת המורה: למצוא את הערוץ שעובד להורה, לא את הערוץ שנוח למורה. לאבות, המגרש. לאמהות, הטלפון והספסל. לסבתות, הבית. להתחיל מהחיובי. ולתת להורים תפקיד שהם טובים בו. ברמת בית הספר: לבנות דרכים להגיע לאבות, כי היום בית הספר מדבר רק עם האמהות, וזה חצי מההורים. יום ספורט משפחות, קבוצות, הורים מאמנים, מה שהולך. ולבנות דרכים שבהן אמהות נפגשות זו עם זו, כי ספסל אמהות עושה יותר מכל אסיפת הורים. לתת למחנכות הכשרה וליווי. לפתוח את המגרש אחרי הצהריים, כי זה המקום הבטוח היחיד בשכונה, ולדאוג שיהיה בו מקום גם לבנות. ולהחזיר הורים למחנכת אחרי שהמנהל הרגיע. ברמת העירייה: מגרשים. אני יודעת שזה נשמע פשוט, אבל בשכונה שלנו אין מגרש ציבורי אחד תקין, והילדים משחקים בכביש, וההורים מפחדים, ולבנות אין בכלל. מגרש מואר בשכונה היה עושה לקשר בין בית הספר, הילדים וההורים יותר מכל תוכנית. ותקשורת בערבית, ועובדת סוציאלית בבית הספר, וביטחון, כמו שכולן אומרות.</w:t>
       </w:r>
     </w:p>
     <w:p>
@@ -8287,7 +8287,7 @@
           <w:szCs w:val="24"/>
           <w:rtl/>
         </w:rPr>
-        <w:t xml:space="preserve">המסר שלי הוא על האבות. כל השיח על "מעורבות הורים" הוא בפועל שיח על אמהות, וזה לא מספיק. בלוד, האבא הוא מי שמחליט על הרבה דברים, והוא לא בבית הספר, ואף אחד לא בונה לו דלת. אני בניתי דלת דרך כדורגל, ומישהו אחר יכול לבנות דרך משהו אחר, אבל צריך לבנות. ולמחקר: תשאלי את ההורים לא רק מה בית הספר יכול לעשות, אלא מה הם טובים בו. בשוק הקהילה, במגרש, בסיפורים של הסבתות, ההורים הכי "לא מעורבים" הפכו למעורבים ביום אחד, כי מישהו ביקש מהם משהו שהם יודעים לעשות.</w:t>
+        <w:t xml:space="preserve">המסר שלי הוא על הגוף והמגרש. כל השיח על "מעורבות הורים" הוא על אסיפות ועל הודעות, והדבר שהכי הביא הורים לבית הספר אצלי היה משחק. אבות שלא דרכו בבית הספר באו לראות את הבן כובש, ואמהות שחשבו שבת לא צריכה ספורט יושבות היום על ספסל כל אימון. בלוד, איפה שאין מקום בטוח לילדים, המגרש של בית הספר הוא המקום שבו ההורים והמורה יכולים להיפגש בלי שאף אחד מרגיש שקוראים לו לסדר. ולמחקר: תשאלי את ההורים לא רק מה בית הספר יכול לעשות, אלא מה הם טובים בו. במגרש, ההורים הכי "לא מעורבים" הפכו למעורבים ביום אחד, כי מישהי ביקשה מהם משהו שהם יודעים לעשות.</w:t>
       </w:r>
     </w:p>
     <w:p>
@@ -8340,7 +8340,7 @@
           <w:szCs w:val="24"/>
           <w:rtl/>
         </w:rPr>
-        <w:t xml:space="preserve">מגדר: גבר</w:t>
+        <w:t xml:space="preserve">מגדר: אישה</w:t>
       </w:r>
     </w:p>
     <w:p>
@@ -8408,7 +8408,7 @@
           <w:szCs w:val="24"/>
           <w:rtl/>
         </w:rPr>
-        <w:t xml:space="preserve">תפקיד בבית הספר: מורה לחינוך גופני ומחנך כיתה ג', מאמן קבוצת הכדורגל של בית הספר</w:t>
+        <w:t xml:space="preserve">תפקיד בבית הספר: מורה לחינוך גופני ומחנכת כיתה ג', מאמנת קבוצות הכדורסל והכדורגל של בית הספר</w:t>
       </w:r>
     </w:p>
     <w:p>
@@ -9863,24 +9863,24 @@
           <w:szCs w:val="28"/>
           <w:rtl/>
         </w:rPr>
-        <w:t xml:space="preserve">ראיון 8: ח'אלד (שם בדוי), בית הספר אל-ראזי (חטיבת ביניים, לוד)</w:t>
-      </w:r>
-    </w:p>
-    <w:p>
-      <w:pPr>
-        <w:bidi/>
-        <w:spacing w:after="120" w:line="360" w:lineRule="auto"/>
-        <w:jc w:val="both"/>
-      </w:pPr>
-      <w:r>
-        <w:rPr>
-          <w:noProof/>
-          <w:rFonts w:ascii="David" w:cs="David" w:eastAsia="David" w:hAnsi="David"/>
-          <w:sz w:val="24"/>
-          <w:szCs w:val="24"/>
-          <w:rtl/>
-        </w:rPr>
-        <w:t xml:space="preserve">מראיינת: מראיינת (שם יושלם)    תאריך הראיון: 12.10.2026    משך: 47 דקות    מקום: חדר רכז החינוך החברתי, בשעת חלון</w:t>
+        <w:t xml:space="preserve">ראיון 8: סוהא (שם בדוי), בית הספר אל-ראזי (חטיבת ביניים, לוד)</w:t>
+      </w:r>
+    </w:p>
+    <w:p>
+      <w:pPr>
+        <w:bidi/>
+        <w:spacing w:after="120" w:line="360" w:lineRule="auto"/>
+        <w:jc w:val="both"/>
+      </w:pPr>
+      <w:r>
+        <w:rPr>
+          <w:noProof/>
+          <w:rFonts w:ascii="David" w:cs="David" w:eastAsia="David" w:hAnsi="David"/>
+          <w:sz w:val="24"/>
+          <w:szCs w:val="24"/>
+          <w:rtl/>
+        </w:rPr>
+        <w:t xml:space="preserve">מראיינת: מראיינת (שם יושלם)    תאריך הראיון: 12.10.2026    משך: 47 דקות    מקום: חדר רכזת החינוך החברתי, בשעת חלון</w:t>
       </w:r>
     </w:p>
     <w:p>
@@ -9976,7 +9976,7 @@
           <w:szCs w:val="24"/>
           <w:rtl/>
         </w:rPr>
-        <w:t xml:space="preserve">אני בן ארבעים ושמונה, רכז החינוך החברתי של חטיבת הביניים אל-ראזי ומורה להיסטוריה. אני מלמד עשרים ושתיים שנים, ארבע עשרה מהן באל-ראזי. אני מלוד, יליד העיר, מהמשפחות הוותיקות, ולמדתי בעצמי באל-ראזי כשהוא היה עוד בבניין הישן. למדתי היסטוריה ותעודת הוראה, ואחר כך תואר שני בחינוך. התחלתי ללמד בתיכון בלוד, שמונה שנים, ועברתי לחטיבה כשהציעו לי את ריכוז החינוך החברתי, כי הרגשתי שבחטיבה אפשר עדיין להשפיע, ובתיכון כבר מאוחר. בתור רכז חינוך חברתי אני אחראי על כל מה שלא לימודי: טקסים, פעילויות, מועצת תלמידים, ובפועל גם הקשר עם ועד ההורים והקהילה, כי אין מי שאחראי על זה. אני מלמד היסטוריה בכיתות ח' ו-ט', ואני מכיר כמעט כל משפחה בעיר, כי לימדתי את ההורים, את הדודים, ולפעמים את הסבים.</w:t>
+        <w:t xml:space="preserve">אני בת ארבעים ושמונה, רכזת החינוך החברתי של חטיבת הביניים אל-ראזי ומורה להיסטוריה. אני מלמדת עשרים ושתיים שנים, ארבע עשרה מהן באל-ראזי. אני מלוד, ילידת העיר, מאחת המשפחות הוותיקות, ולמדתי בעצמי באל-ראזי כשהוא היה עוד בבניין הישן. למדתי היסטוריה ותעודת הוראה, ואחר כך תואר שני בחינוך. התחלתי ללמד בתיכון בלוד, שמונה שנים, ועברתי לחטיבה כשהציעו לי את ריכוז החינוך החברתי, כי הרגשתי שבחטיבה אפשר עדיין להשפיע, ובתיכון כבר מאוחר. בתור רכזת חינוך חברתי אני אחראית על כל מה שלא לימודי: טקסים, פעילויות, מועצת תלמידים, ובפועל גם הקשר עם ועד ההורים והקהילה, כי אין מי שאחראי על זה. אני מלמדת היסטוריה בכיתות ח' ו-ט', ואני מכירה כמעט כל משפחה בעיר, כי לימדתי את ההורים, את הדודים, ולפעמים את הדודות שגידלו אותם.</w:t>
       </w:r>
     </w:p>
     <w:p>
@@ -10048,7 +10048,7 @@
           <w:szCs w:val="24"/>
           <w:rtl/>
         </w:rPr>
-        <w:t xml:space="preserve">אל-ראזי הוא חטיבת ביניים שמשרתת את כל השכונות הערביות של לוד, וזה אומר שהוא מקום המפגש של העיר הערבית: כל המשפחות, כל הסכסוכים, כל ההבדלים, נפגשים בחצר שלנו. קהילת ההורים שלנו היא בעצם הקהילה הערבית של לוד, על כל חלקיה: משפחות ותיקות, שיש להן מעמד וכבוד, ולפעמים גם סכסוכים ישנים, משפחות בדואיות שהגיעו מהנגב בשנות השבעים והשמונים ושעדיין נחשבות "חדשות", משפחות מהמשולש והגליל, ומשפחות שהגיעו לאחרונה. בכיתות שאני מלמד, ההורים הם בני ארבעים בערך, ורובם היו תלמידים שלי או של חבריי, כך שהקשר שלי איתם הוא קשר של דור. מה שמאפיין את המשפחות בלוד, מעבר לעוני ולאלימות, שכולם ידברו עליהם: הכבוד. הכבוד של המשפחה הוא הדבר שמנהל את היחסים עם בית הספר, ומי שלא מבין את זה לא יבין למה הורה בא עם דודים, ולמה הורה לא מגיע לאסיפה, ולמה בת לא נוסעת לטיול.</w:t>
+        <w:t xml:space="preserve">אל-ראזי הוא חטיבת ביניים שמשרתת את כל השכונות הערביות של לוד, וזה אומר שהוא מקום המפגש של העיר הערבית: כל המשפחות, כל הסכסוכים, כל ההבדלים, נפגשים בחצר שלנו. קהילת ההורים שלנו היא בעצם הקהילה הערבית של לוד, על כל חלקיה: משפחות ותיקות, שיש להן מעמד וכבוד, ולפעמים גם סכסוכים ישנים, משפחות בדואיות שהגיעו מהנגב בשנות השבעים והשמונים ושעדיין נחשבות "חדשות", משפחות מהמשולש והגליל, ומשפחות שהגיעו לאחרונה. בכיתות שאני מלמדת, ההורים הם בני ארבעים בערך, ורובם היו תלמידים שלי או של חברותיי, כך שהקשר שלי איתם הוא קשר של דור. מה שמאפיין את המשפחות בלוד, מעבר לעוני ולאלימות, שכולם ידברו עליהם: הכבוד. הכבוד של המשפחה הוא הדבר שמנהל את היחסים עם בית הספר, ומי שלא מבין את זה לא יבין למה הורה בא עם דודים, ולמה הורה לא מגיע לאסיפה, ולמה בת לא נוסעת לטיול.</w:t>
       </w:r>
     </w:p>
     <w:p>
@@ -10108,7 +10108,7 @@
           <w:szCs w:val="24"/>
           <w:rtl/>
         </w:rPr>
-        <w:t xml:space="preserve">אחרי עשרים ושתיים שנים, אני רואה את הקשר עם ההורים כמשהו רחב יותר מקשר עם ההורים של הילד: זה הקשר בין בית הספר לעיר. בחטיבה, ההורים הם הקהילה, ואם הקהילה סומכת על בית הספר, הילדים נשארים בו, ואם היא לא, הם נושרים. המשמעות בשבילי כרכז חינוך חברתי היא שבית הספר צריך להיות מוסד של הקהילה, לא מוסד בתוך הקהילה. ובשבילי כמורה להיסטוריה יש משמעות נוספת: אני מלמד את הילדים את ההיסטוריה של העיר שלהם, של לוד, ואת זה אני לא יכול לעשות בלי ההורים והסבים, כי ההיסטוריה של לוד הערבית לא כתובה בספרי הלימוד, היא בבתים. וכמובן, יש המשמעות הפשוטה: ילד בן ארבע עשרה בלוד, בלי קשר בין הבית לבית הספר, הוא ילד שהרחוב יקבל. ראיתי את זה יותר מדי פעמים.</w:t>
+        <w:t xml:space="preserve">אחרי עשרים ושתיים שנים, אני רואה את הקשר עם ההורים כמשהו רחב יותר מקשר עם ההורים של הילד: זה הקשר בין בית הספר לעיר. בחטיבה, ההורים הם הקהילה, ואם הקהילה סומכת על בית הספר, הילדים נשארים בו, ואם היא לא, הם נושרים. המשמעות בשבילי כרכזת חינוך חברתי היא שבית הספר צריך להיות מוסד של הקהילה, לא מוסד בתוך הקהילה. ובשבילי כמורה להיסטוריה יש משמעות נוספת: אני מלמדת את הילדים את ההיסטוריה של העיר שלהם, של לוד, ואת זה אני לא יכולה לעשות בלי ההורים והסבים והסבתות, כי ההיסטוריה של לוד הערבית לא כתובה בספרי הלימוד, היא בבתים, ובעיקר אצל הנשים הזקנות, שזוכרות הכול. וכמובן, יש המשמעות הפשוטה: ילד בן ארבע עשרה בלוד, בלי קשר בין הבית לבית הספר, הוא ילד שהרחוב יקבל. ראיתי את זה יותר מדי פעמים.</w:t>
       </w:r>
     </w:p>
     <w:p>
@@ -10199,7 +10199,7 @@
           <w:szCs w:val="24"/>
           <w:rtl/>
         </w:rPr>
-        <w:t xml:space="preserve">כרכז אני עובד בעיקר עם ועד ההורים, בפגישות, בטלפונים, ובקבוצת ווטסאפ של הוועד. אני גם מארגן את האירועים שבהם ההורים מגיעים: טקסים, ערבי הורים, יום המשפחה. כמורה, יש לי קבוצות של הכיתות שאני מלמד, ואני משתמש בטלפון, הרבה, ואני מהדור שמתקשר ולא כותב. משו"ב, אני מעדכן. ויש ערוץ שהוא אולי הכי חשוב שלי: המג'לס. אני מלוד, ואני יושב במפגשים של המשפחות, בחתונות, באבלים, ושם אני פוגש אבות שלא יגיעו לבית הספר אף פעם, ומדבר איתם על הילדים. זה לא ערוץ רשמי, ואני לא יודע איך רושמים אותו במחקר, אבל הוא עובד. מה שעובד הכי טוב: המפגש האישי, בבית הספר או מחוצה לו. ווטסאפ הוא ליידע, הטלפון לתאם, והפגישה לשכנע. ויש משהו שלמדתי: בלוד, פגישה עם אבא עובדת טוב יותר כשיש בה מישהו שלישי שהוא מכבד, ואני, בגלל המעמד שלי בעיר, הרבה פעמים האדם השלישי הזה בשביל המחנכות.</w:t>
+        <w:t xml:space="preserve">כרכזת אני עובדת בעיקר עם ועד ההורים, בפגישות, בטלפונים, ובקבוצת ווטסאפ של הוועד. אני גם מארגנת את האירועים שבהם ההורים מגיעים: טקסים, ערבי הורים, יום המשפחה. כמורה, יש לי קבוצות של הכיתות שאני מלמדת, ואני משתמשת בטלפון, הרבה, ואני מהדור שמתקשר ולא כותב. משו"ב, אני מעדכנת. ויש ערוץ שהוא אולי הכי חשוב שלי, ושאישה יכולה לעבוד בו בדרך שגבר לא: הבתים. אני מלוד, ממשפחה מוכרת, ואני נכנסת לבתים של המשפחות, לחדר של הנשים, בשמחות ובאבלים, ושם אני פוגשת את האמהות ואת הסבתות ואת הדודות, שהן מי שמנהל את הבית בפועל, ושאף מורה גבר לא יפגוש. לאבות ולזקני המשפחות אני מגיעה דרך הנשים, או עם המנהל כשצריך. זה לא ערוץ רשמי, ואני לא יודעת איך רושמים אותו במחקר, אבל הוא עובד. מה שעובד הכי טוב: המפגש האישי, בבית הספר או בבית. ווטסאפ הוא ליידע, הטלפון לתאם, והפגישה לשכנע.</w:t>
       </w:r>
     </w:p>
     <w:p>
@@ -10259,7 +10259,7 @@
           <w:szCs w:val="24"/>
           <w:rtl/>
         </w:rPr>
-        <w:t xml:space="preserve">כרכז, ההורים פונים אליי על דברים שהם מעבר לכיתה: תלונות על מורים, בקשות להעביר ילד כיתה, בעיות בין משפחות שמגיעות לבית הספר, ובשנים האחרונות, בעיות ביטחון: "יש סכסוך בין המשפחות, אני מפחד לשלוח את הילד". ופונים אליי, כמי שמכיר את העיר, בבקשות עזרה מול העירייה והמשטרה. אני פונה להורים, כרכז, בהזמנות ובבקשות לשיתוף פעולה, וכמורה, על ילדים שאני רואה שהם מתרחקים. ויש סוג פנייה שאני עושה ואף אחד אחר לא: אני פונה לראשי משפחות. כשיש בעיה שנוגעת לכמה ילדים מאותה משפחה, או סכסוך בין משפחות שנכנס לבית הספר, אני לא מתקשר להורה, אני הולך לזקן המשפחה, ומבקש ממנו לסדר. זה לא נמצא בשום נוהל של משרד החינוך, אבל בלוד זה מה שעובד, ובית הספר צריך לדעת להשתמש במבנה של הקהילה במקום להילחם בו.</w:t>
+        <w:t xml:space="preserve">כרכזת, ההורים פונים אליי על דברים שהם מעבר לכיתה: תלונות על מורים, בקשות להעביר ילד כיתה, בעיות בין משפחות שמגיעות לבית הספר, ובשנים האחרונות, בעיות ביטחון: "יש סכסוך בין המשפחות, אני מפחדת לשלוח את הילד". ופונים אליי, כמי שמכירה את העיר, בבקשות עזרה מול העירייה והמשטרה. האמהות פונות אליי גם בדברים שהן לא יגידו לאף גבר בבית הספר: על בת שרוצה לצאת ללמוד והאבא מתנגד, על בן שהתחיל להסתובב, על מה שקורה בבית. אני פונה להורים, כרכזת, בהזמנות ובבקשות לשיתוף פעולה, וכמורה, על ילדים שאני רואה שהם מתרחקים. ויש סוג פנייה שאני עושה ואף אחד אחר לא: אני פונה לנשים הזקנות של המשפחות. כשיש בעיה שנוגעת לכמה ילדים מאותה משפחה, או סכסוך בין משפחות שנכנס לבית הספר, אני לא מתקשרת להורה, אני הולכת לסבתא של המשפחה, שאצלנו יש לה כוח שאף אחד לא רואה מבחוץ, והיא מדברת עם הגברים. זה לא נמצא בשום נוהל של משרד החינוך, אבל בלוד זה מה שעובד, ובית הספר צריך לדעת להשתמש במבנה של הקהילה במקום להילחם בו.</w:t>
       </w:r>
     </w:p>
     <w:p>
@@ -10331,7 +10331,7 @@
           <w:szCs w:val="24"/>
           <w:rtl/>
         </w:rPr>
-        <w:t xml:space="preserve">השיחה שהכי השפיעה עליי הייתה לפני עשר שנים, עם סבא של תלמיד, אדם מבוגר ומכובד מאחת המשפחות הגדולות בעיר. הנכד שלו היה מעורב באלימות קשה, והאבא לא ענה, ואז הלכתי לסבא, הביתה. הוא קיבל אותי בכבוד, והקשיב, ואז אמר משפט שאני זוכר: "בית הספר קורא לנו רק כשיש בעיה. אתם לא באים אלינו כשיש חתונה." ואני הבנתי שהוא צודק. בית הספר היה בשבילו מוסד שבא לדרוש ולא מוסד שבא לכבד. הנכד טופל, הסבא דאג לזה, אבל מה שלקחתי מהשיחה היה אחר: מאז, בית הספר, דרכי, משתתף באירועים של הקהילה, באבלים, בחתונות, לא כמוסד, אלא כחלק. וכשאני בא להורה עם בעיה, אני כבר הייתי אצלו בשמחה. לפני השיחה הרגשתי שאני הולך לבקש עזרה. אחרי השיחה הרגשתי שקיבלתי שיעור על מה זה קהילה, מאדם שלא למד באוניברסיטה.</w:t>
+        <w:t xml:space="preserve">השיחה שהכי השפיעה עליי הייתה לפני עשר שנים, עם סבתא של תלמיד, אישה מבוגרת ומכובדת מאחת המשפחות הגדולות בעיר. הנכד שלה היה מעורב באלימות קשה, והאבא לא ענה, והאמא פחדה, ואז הלכתי לסבתא, הביתה. היא קיבלה אותי בכבוד, והקשיבה, ואז אמרה משפט שאני זוכרת: "בית הספר קורא לנו רק כשיש בעיה. אתם לא באים אלינו כשיש חתונה." ואני הבנתי שהיא צודקת. בית הספר היה בשבילה מוסד שבא לדרוש ולא מוסד שבא לכבד. הנכד טופל, הסבתא דאגה לזה, היא דיברה עם הבן שלה ועם הבעל שלה, ובתוך שבוע הילד היה בכיתה. אבל מה שלקחתי מהשיחה היה אחר: מאז, בית הספר, דרכי, משתתף באירועים של הקהילה, באבלים, בחתונות, לא כמוסד, אלא כחלק. וכשאני באה להורה עם בעיה, אני כבר הייתי אצלו בשמחה. לפני השיחה הרגשתי שאני הולכת לבקש עזרה. אחרי השיחה הרגשתי שקיבלתי שיעור על מה זה קהילה, מאישה שלא למדה בבית ספר בכלל.</w:t>
       </w:r>
     </w:p>
     <w:p>
@@ -10403,7 +10403,7 @@
           <w:szCs w:val="24"/>
           <w:rtl/>
         </w:rPr>
-        <w:t xml:space="preserve">אני אגיד דבר לא פופולרי: הדיגיטלי הזיק לקשר עם הקהילה שלנו יותר ממה שעזר. הוא עזר ליידע, ההורים יודעים הכול, זה נכון. אבל הוא שינה את האופי של הקשר: במקום פגישה בין אנשים, יש הודעות בין תפקידים. ובקהילה כמו שלנו, שבה הכבוד הוא הכול, הודעה כתובה היא דבר מסוכן, כי היא נשמרת, מועברת, נקראת לא נכון, ומגיעה למג'לס. ראיתי סכסוך בין שתי משפחות שהתחיל מהודעה של מורה בקבוצת כיתה. הדיגיטלי גם מדיר את מי שהכי צריך: הסבים, ראשי המשפחות, הם לא בווטסאפ, וכל הסמכות של הקהילה נשארת מחוץ לתקשורת של בית הספר. פנים אל פנים לעומת הודעות: בפנים יש כבוד, בהודעה אין. כשאני יושב עם אבא, אני כבר כיבדתי אותו בזה שבאתי. כשאני שולח הודעה, אני "בית הספר", והוא "ההורה", ובקהילה שלנו זה לא מספיק. אני משתמש בדיגיטלי ליידע, ופוגש בשביל כל השאר, גם כשזה לוקח יותר זמן.</w:t>
+        <w:t xml:space="preserve">אני אגיד דבר לא פופולרי: הדיגיטלי הזיק לקשר עם הקהילה שלנו יותר ממה שעזר. הוא עזר ליידע, ההורים יודעים הכול, זה נכון. אבל הוא שינה את האופי של הקשר: במקום פגישה בין אנשים, יש הודעות בין תפקידים. ובקהילה כמו שלנו, שבה הכבוד הוא הכול, הודעה כתובה היא דבר מסוכן, כי היא נשמרת, מועברת, נקראת לא נכון, ומגיעה למג'לס. ראיתי סכסוך בין שתי משפחות שהתחיל מהודעה של מורה בקבוצת כיתה. הדיגיטלי גם מדיר את מי שהכי צריך: הסבתות, הזקנות, שאצלנו הן הסמכות האמיתית בבית, הן לא בווטסאפ, וכל הכוח הזה נשאר מחוץ לתקשורת של בית הספר. פנים אל פנים לעומת הודעות: בפנים יש כבוד, בהודעה אין. כשאני יושבת עם אמא בבית שלה, אני כבר כיבדתי אותה בזה שבאתי. כשאני שולחת הודעה, אני "בית הספר", והיא "ההורה", ובקהילה שלנו זה לא מספיק. אני משתמשת בדיגיטלי ליידע, ופוגשת בשביל כל השאר, גם כשזה לוקח יותר זמן.</w:t>
       </w:r>
     </w:p>
     <w:p>
@@ -10475,7 +10475,7 @@
           <w:szCs w:val="24"/>
           <w:rtl/>
         </w:rPr>
-        <w:t xml:space="preserve">הגיוון של לוד הוא ההיסטוריה שאני מלמד. אל-ראזי הוא המקום שבו כל הקהילה הערבית של העיר נפגשת, עם ההבדלים: הוותיקים שרואים את עצמם כבעלי הבית, הבדואים שעדיין נחשבים "חדשים" אחרי חמישים שנה, הכפריים, ויש מתחים, ויש נישואים בין הקבוצות שמשנים את זה לאט. וסביב הקהילה שלנו, העיר היהודית, עם הגרעין התורני, עם העולים, עם השכונות שמשתנות, ואנחנו הולכים ברחובות שלה. הילדים שלי חיים את הגיוון הזה בקניון ובכביש, וההורים חיים אותו בעבודה, ובית הספר צריך לדבר על זה, ואנחנו מדברים, בהיסטוריה ובחינוך חברתי. אחרי מאי 2021, כשהעיר בערה, ההורים שלנו היו בפחד ובכעס, ואנחנו פתחנו את בית הספר לערב שיחה עם ההורים, לא על הילדים, על העיר, ובאו מאתיים. פער שפה: המערכת בעברית, וההורים המבוגרים לא. פער תרבות: לא מול ההורים, אלא מול המערכת: מפקחת שלא הבינה למה אני "מערב" זקני משפחות בעניינים של בית הספר, והייתי צריך להסביר שבלוד זה לא ערבוב, זה המבנה.</w:t>
+        <w:t xml:space="preserve">הגיוון של לוד הוא ההיסטוריה שאני מלמדת. אל-ראזי הוא המקום שבו כל הקהילה הערבית של העיר נפגשת, עם ההבדלים: הוותיקים שרואים את עצמם כבעלי הבית, הבדואים שעדיין נחשבים "חדשים" אחרי חמישים שנה, הכפריים, ויש מתחים, ויש נישואים בין הקבוצות שמשנים את זה לאט. וסביב הקהילה שלנו, העיר היהודית, עם הגרעין התורני, עם העולים, עם השכונות שמשתנות, ואנחנו הולכים ברחובות שלה. הילדים שלי חיים את הגיוון הזה בקניון ובכביש, וההורים חיים אותו בעבודה, ובית הספר צריך לדבר על זה, ואנחנו מדברים, בהיסטוריה ובחינוך חברתי. אחרי מאי 2021, כשהעיר בערה, ההורים שלנו היו בפחד ובכעס, ואנחנו פתחנו את בית הספר לערב שיחה עם ההורים, לא על הילדים, על העיר, ובאו מאתיים. פער שפה: המערכת בעברית, וההורים המבוגרים לא. פער תרבות: לא מול ההורים, אלא מול המערכת: מפקחת שלא הבינה למה אני "מערבת" סבתות וזקני משפחות בעניינים של בית הספר, והייתי צריכה להסביר שבלוד זה לא ערבוב, זה המבנה.</w:t>
       </w:r>
     </w:p>
     <w:p>
@@ -10566,7 +10566,7 @@
           <w:szCs w:val="24"/>
           <w:rtl/>
         </w:rPr>
-        <w:t xml:space="preserve">כרכז, אני זה שבונה את השותפות עם ההורים בבית הספר, ואני אגיד מה יש ומה אין. יש ועד הורים, שנפגש איתי ועם המנהל, ושהוא שותף בהחלטות על אירועים, על תשלומים, על טיולים, ולפעמים על נהלים, למשל נוהל הטלפונים השנה היה בהתייעצות איתו. יש הורים בטקסים ובפעילויות. יש "יום המשפחה", שבו ההורים והסבים באים לבית הספר. ויש מה שאני קורא לו "מועצת הקהילה", שאני הקמתי לפני שש שנים: נציגים של המשפחות הגדולות בעיר, לא בהכרח הורים לתלמידים, שנפגשים איתי פעמיים בשנה ומדברים על בית הספר והעיר. בקבלת החלטות פדגוגיות, לא, וזה בסדר. בהחלטות על החיים של בית הספר, כן, יותר מברוב בתי הספר. ואני חושב שההורים בלוד שותפים כשהשותפות בנויה על המבנה שלהם, המשפחה, הכבוד, הזקנים, ולא על המבנה של משרד החינוך, הוועד הנבחר. הוועד אצלנו קיים כי צריך, מועצת הקהילה קיימת כי היא עובדת.</w:t>
+        <w:t xml:space="preserve">כרכזת, אני זו שבונה את השותפות עם ההורים בבית הספר, ואני אגיד מה יש ומה אין. יש ועד הורים, שנפגש איתי ועם המנהל, ושהוא שותף בהחלטות על אירועים, על תשלומים, על טיולים, ולפעמים על נהלים, למשל נוהל הטלפונים השנה היה בהתייעצות איתו. יש הורים בטקסים ובפעילויות. יש "יום המשפחה", שבו ההורים והסבים והסבתות באים לבית הספר. ויש מה שאני קוראת לו "מועצת הקהילה", שאני הקמתי לפני שש שנים: נציגים של המשפחות הגדולות בעיר, גברים ונשים, לא בהכרח הורים לתלמידים, שנפגשים איתי פעמיים בשנה ומדברים על בית הספר והעיר. בקבלת החלטות פדגוגיות, לא, וזה בסדר. בהחלטות על החיים של בית הספר, כן, יותר מברוב בתי הספר. ואני חושבת שההורים בלוד שותפים כשהשותפות בנויה על המבנה שלהם, המשפחה, הכבוד, הזקנים והזקנות, ולא על המבנה של משרד החינוך, הוועד הנבחר. הוועד אצלנו קיים כי צריך, מועצת הקהילה קיימת כי היא עובדת.</w:t>
       </w:r>
     </w:p>
     <w:p>
@@ -10626,7 +10626,7 @@
           <w:szCs w:val="24"/>
           <w:rtl/>
         </w:rPr>
-        <w:t xml:space="preserve">המקרה שהכי הצליח, בעיניי, הוא סיום סכסוך בין שתי משפחות שהשפיע על בית הספר. לפני ארבע שנים היה סכסוך קשה בין שתי משפחות גדולות בעיר, עם אלימות, והילדים של שתי המשפחות למדו אצלנו, באותן כיתות, והיו קטטות בחצר, וההורים דרשו להפריד. במקום להפריד, הלכתי, עם המנהל, לראשי שתי המשפחות, ובנפרד, וביקשתי דבר אחד: שבית הספר יהיה מחוץ לסכסוך. שהילדים יוכלו ללמוד יחד, ושהמשפחות יתחייבו לזה. שתי המשפחות הסכימו, וזה נשמר, גם בזמן שהסכסוך בחוץ נמשך. ובתוך בית הספר, הילדים של שתי המשפחות היו בפרויקט משותף של מועצת התלמידים, בכוונה. מה שגרם להצלחה: שבית הספר לא ניסה להיות שופט, אלא מקום. שפנינו לסמכות האמיתית של הקהילה, הזקנים, ולא להורים, שלא יכלו להחליט. ושהבקשה הייתה קטנה וברורה. ולמדתי שבלוד שיתוף פעולה עם הורים הוא לפעמים שיתוף פעולה עם המשפחה המורחבת, ושבית הספר שיודע את זה יכול להשיג דברים שהמשטרה לא.</w:t>
+        <w:t xml:space="preserve">המקרה שהכי הצליח, בעיניי, הוא סיום סכסוך בין שתי משפחות שהשפיע על בית הספר. לפני ארבע שנים היה סכסוך קשה בין שתי משפחות גדולות בעיר, עם אלימות, והילדים של שתי המשפחות למדו אצלנו, באותן כיתות, והיו קטטות בחצר, וההורים דרשו להפריד. במקום להפריד, הלכתי, קודם לנשים: לאמהות ולסבתות של שתי המשפחות, בנפרד, בבתים, וביקשתי דבר אחד: שבית הספר יהיה מחוץ לסכסוך. שהילדים יוכלו ללמוד יחד, ושהמשפחות יתחייבו לזה. הנשים הסכימו, והן אלה שהביאו את זה לגברים, ואז המנהל ואני הלכנו לראשי המשפחות לסגור. זה נשמר, גם בזמן שהסכסוך בחוץ נמשך. ובתוך בית הספר, הילדים של שתי המשפחות היו בפרויקט משותף של מועצת התלמידים, בכוונה. מה שגרם להצלחה: שבית הספר לא ניסה להיות שופט, אלא מקום. שפנינו לסמכות האמיתית של הקהילה, ושידענו שהדרך לגברים עוברת דרך הנשים. ושהבקשה הייתה קטנה וברורה. ולמדתי שבלוד שיתוף פעולה עם הורים הוא לפעמים שיתוף פעולה עם המשפחה המורחבת, ושבית הספר שיודע את זה יכול להשיג דברים שהמשטרה לא.</w:t>
       </w:r>
     </w:p>
     <w:p>
@@ -10698,7 +10698,7 @@
           <w:szCs w:val="24"/>
           <w:rtl/>
         </w:rPr>
-        <w:t xml:space="preserve">המקרה הקשה שלי היה כשאבא של תלמידה האשים אותי שאני "מתערב" במשפחה שלו, אחרי שהבת סיפרה למחנכת על אלימות בבית ואנחנו דיווחנו לרווחה, כמו שחוק מחייב. האבא בא אליי, לא למנהל, כי אני מלוד, ואמר לי שאני מביש את המשפחה שלו בפני "היהודים", הרווחה, ושאני בוגד. זה היה כואב, כי אני באמת מלוד ואני באמת מבין את הפחד שלו מהרווחה. הרגשתי קרוע: החוק והילדה מצד אחד, הקהילה שלי מצד שני. התמודדתי בכך שלא התנצלתי על הדיווח, אבל הלכתי איתו לרווחה, בעצמי, וישבתי איתו שם, ותרגמתי, ודאגתי שהתהליך יהיה בכבוד. היה קשה, והיה טיפול, והמשפחה נשארה יחד. מה שלמדתי: שהתפקיד שלי כמורה מהקהילה הוא לא לבחור בין החוק לקהילה, אלא לעמוד ביניהם ולתרגם, לשני הכיוונים. ושהורים בלוד מפחדים מהרווחה יותר מהמשטרה, ושבית הספר צריך להיות הגשר, לא השער.</w:t>
+        <w:t xml:space="preserve">המקרה הקשה שלי היה כשאבא של תלמידה האשים אותי שאני "מתערבת" במשפחה שלו, אחרי שהבת סיפרה למחנכת על אלימות בבית ואנחנו דיווחנו לרווחה, כמו שחוק מחייב. האבא בא אליי, לא למנהל, כי אני מלוד ומהמשפחות, ואמר לי שאני מבישה את המשפחה שלו בפני "היהודים", הרווחה, ושאישה מהעיר לא עושה דבר כזה, ושאני בוגדת. זה היה כואב, כי אני באמת מלוד ואני באמת מבינה את הפחד שלו מהרווחה, ואני באמת אישה מהעיר, והוא השתמש בזה. הרגשתי קרועה: החוק והילדה מצד אחד, הקהילה שלי מצד שני. התמודדתי בכך שלא התנצלתי על הדיווח, אבל הלכתי איתו ועם אשתו לרווחה, בעצמי, וישבתי איתם שם, ותרגמתי, ודאגתי שהתהליך יהיה בכבוד. היה קשה, והיה טיפול, והמשפחה נשארה יחד. מה שלמדתי: שהתפקיד שלי כמורה מהקהילה הוא לא לבחור בין החוק לקהילה, אלא לעמוד ביניהם ולתרגם, לשני הכיוונים. ושהורים בלוד מפחדים מהרווחה יותר מהמשטרה, ושבית הספר צריך להיות הגשר, לא השער.</w:t>
       </w:r>
     </w:p>
     <w:p>
@@ -10758,7 +10758,7 @@
           <w:szCs w:val="24"/>
           <w:rtl/>
         </w:rPr>
-        <w:t xml:space="preserve">ההבדל בין הורים מעורבים ללא מעורבים אצלנו הוא פחות עניין של השכלה ויותר עניין של מעמד בקהילה: משפחות עם מעמד מעורבות, כי בית הספר הוא מקום שבו רואים אותן. משפחות בלי מעמד, החדשות, החלשות, אלה שיש להן בעיה עם החוק, לא מעורבות, כי הן מרגישות שאין להן מקום. ובחטיבה זה מתווסף לעייפות: ההורים של ילד רביעי או חמישי כבר ראו הכול. אני מגיע ללא מעורבים דרך המבנה: דרך הזקנים, דרך משפחה מכובדת שתלווה אותם, דרך יום המשפחה שבו כולם מוזמנים באותו כבוד. ודרך דבר שאני מקפיד עליו: בכל אירוע של בית הספר, אני מזמין אישית, בטלפון, את המשפחות החלשות, ומושיב אותן בשורה הראשונה. זה נשמע קטן. בקהילה שלנו, השורה הראשונה היא הכול. ודרך הילדים: ילד ממשפחה לא מעורבת מקבל ממני תפקיד במועצת התלמידים, ואז ההורים שלו באים לראות אותו. אני לא מצליח עם כולם, אבל אני יודע שאף אחד לא נשאר בחוץ בגלל שלא הזמנתי.</w:t>
+        <w:t xml:space="preserve">ההבדל בין הורים מעורבים ללא מעורבים אצלנו הוא פחות עניין של השכלה ויותר עניין של מעמד בקהילה: משפחות עם מעמד מעורבות, כי בית הספר הוא מקום שבו רואים אותן. משפחות בלי מעמד, החדשות, החלשות, אלה שיש להן בעיה עם החוק, לא מעורבות, כי הן מרגישות שאין להן מקום. ובחטיבה זה מתווסף לעייפות: ההורים של ילד רביעי או חמישי כבר ראו הכול. אני מגיעה ללא מעורבים דרך המבנה: דרך הנשים הזקנות, דרך משפחה מכובדת שתלווה אותם, דרך יום המשפחה שבו כולם מוזמנים באותו כבוד. ודרך דבר שאני מקפידה עליו: בכל אירוע של בית הספר, אני מזמינה אישית, בטלפון, את המשפחות החלשות, ומושיבה אותן בשורה הראשונה. זה נשמע קטן. בקהילה שלנו, השורה הראשונה היא הכול. ודרך הילדים: ילד ממשפחה לא מעורבת מקבל ממני תפקיד במועצת התלמידים, ואז ההורים שלו באים לראות אותו. אני לא מצליחה עם כולם, אבל אני יודעת שאף אחד לא נשאר בחוץ בגלל שלא הזמנתי.</w:t>
       </w:r>
     </w:p>
     <w:p>
@@ -10830,7 +10830,7 @@
           <w:szCs w:val="24"/>
           <w:rtl/>
         </w:rPr>
-        <w:t xml:space="preserve">המנהל שלנו הוא לא מלוד, והוא הודה בזה בחוכמה: הוא נותן לי לנהל את הקשר עם הקהילה, ולא מנסה לעשות את זה בעצמו. זה סוג של תמיכה, אולי הטובה ביותר. ההנהלה אצלנו מעודדת שיתוף של הורים ברמה של אירועים ושל ועד, ופחות ברמה של כל מורה: המחנכות נשארות לבד מול ההורים ברוב הזמן, ורק כשיש בעיה אני או המנהל נכנסים. "תומכת" בשבילי זה שלושה דברים: שההנהלה מכבדת את המבנה של הקהילה ולא מנסה לכפות עליו את המבנה של המערכת. שהיא נותנת לרכז זמן וסמכות. ושהיא מגבה מורות גם כשהורה בעל מעמד מתלונן, וזה המבחן האמיתי, כי מול הורה חזק קל לוותר על מורה. "לא תומכת" זה מנהל שמנהל את ההורים כמו שמנהלים משמעת. אצלנו ההנהלה תומכת בקהילה דרכי, ואני דואג שהתמיכה תעבור גם למחנכות.</w:t>
+        <w:t xml:space="preserve">המנהל שלנו הוא לא מלוד, והוא הודה בזה בחוכמה: הוא נותן לי לנהל את הקשר עם הקהילה, ולא מנסה לעשות את זה בעצמו. זה סוג של תמיכה, אולי הטובה ביותר. ההנהלה אצלנו מעודדת שיתוף של הורים ברמה של אירועים ושל ועד, ופחות ברמה של כל מורה: המחנכות נשארות לבד מול ההורים ברוב הזמן, ורק כשיש בעיה אני או המנהל נכנסים. "תומכת" בשבילי זה שלושה דברים: שההנהלה מכבדת את המבנה של הקהילה ולא מנסה לכפות עליו את המבנה של המערכת. שהיא נותנת לרכזת זמן וסמכות. ושהיא מגבה מורות גם כשהורה בעל מעמד מתלונן, וזה המבחן האמיתי, כי מול הורה חזק קל לוותר על מורה. "לא תומכת" זה מנהל שמנהל את ההורים כמו שמנהלים משמעת. אצלנו ההנהלה תומכת בקהילה דרכי, ואני דואגת שהתמיכה תעבור גם למחנכות.</w:t>
       </w:r>
     </w:p>
     <w:p>
@@ -10909,7 +10909,7 @@
           <w:szCs w:val="24"/>
           <w:rtl/>
         </w:rPr>
-        <w:t xml:space="preserve">הכי קשה לי זה המקום שבו אני עומד: בין הקהילה שלי לבין המערכת. אני מלוד, אני חלק מהמשפחות, ואני עובד מדינה שמחויב לחוק, ויש רגעים, כמו הדיווח לרווחה, שבהם שני הצדדים רואים בי בוגד. וקשה לי לראות את הקהילה שלי מתפרקת: הסכסוכים, הירי, הסמים, מגיעים לבית הספר, ואני, כרכז, אמור לעשות "חינוך חברתי" בתוך זה. וקשה לי משהו שקשור לדור: ההורים הצעירים כבר פחות מכבדים את המבנה הישן, הזקנים, המג'לס, אבל עדיין לא בנו משהו אחר, ואני עובד עם מבנה שמתפורר. וקשה לי העיר: בית הספר הוא המוסד היחיד שההורים סומכים עליו, והעירייה לא רואה אותו כשותף, ואני מרגיש שאני נושא לבד את הקשר בין הקהילה למערכת. ואחרי עשרים ושתיים שנים, אני עייף, ואני אומר את זה בכנות למחקר.</w:t>
+        <w:t xml:space="preserve">הכי קשה לי זה המקום שבו אני עומדת: בין הקהילה שלי לבין המערכת. אני מלוד, אני חלק מהמשפחות, ואני עובדת מדינה שמחויבת לחוק, ויש רגעים, כמו הדיווח לרווחה, שבהם שני הצדדים רואים בי בוגדת. וקשה לי, כאישה, שיש דלתות שאני לא יכולה לפתוח לבד: יש זקני משפחות שלא ישבו עם אישה על עניינים של כבוד, ואני צריכה את המנהל או את בעלי כדי שהדברים שאני יודעת יגיעו אליהם. וקשה לי לראות את הקהילה שלי מתפרקת: הסכסוכים, הירי, הסמים, מגיעים לבית הספר, ואני, כרכזת, אמורה לעשות "חינוך חברתי" בתוך זה. וקשה לי העיר: בית הספר הוא המוסד היחיד שההורים סומכים עליו, והעירייה לא רואה אותו כשותף, ואני מרגישה שאני נושאת לבד את הקשר בין הקהילה למערכת. ואחרי עשרים ושתיים שנים, אני עייפה, ואני אומרת את זה בכנות למחקר.</w:t>
       </w:r>
     </w:p>
     <w:p>
@@ -10969,7 +10969,7 @@
           <w:szCs w:val="24"/>
           <w:rtl/>
         </w:rPr>
-        <w:t xml:space="preserve">מה שעוזר לי הוא שאני מלוד, ושאני יודע את המבנה. עוזרת לי מועצת הקהילה שהקמתי. עוזר לי המנהל, שנותן לי מקום. עוזרות לי המחנכות הטובות, שעושות את העבודה היומיומית ושאני רק מגבה. ועוזרת לי ההיסטוריה: כשאני מלמד ילדים על לוד, על המשפחות שלהם, על מה שהיה פה, ההורים באים לשמוע, והקשר נבנה דרך גאווה ולא דרך בעיות. הכשרה: תואר שני בחינוך נתן לי מושגים, "הון חברתי", "שותפות", אבל שום דבר על קהילה ערבית בעיר מעורבת. קורס רכזי חינוך חברתי לא עסק בהורים בכלל. ליווי, אין, ואני כבר הליווי של אחרים. מה שהיה עוזר: פורום של רכזי קהילה מבתי ספר ערביים בערים מעורבות, לוד, רמלה, יפו, עכו, כי הבעיות שלנו דומות ואף אחד לא מדבר עליהן יחד.</w:t>
+        <w:t xml:space="preserve">מה שעוזר לי הוא שאני מלוד, ושאני יודעת את המבנה, ושאני אישה שיכולה להיכנס לבתים ולחדרים שבהם מתקבלות ההחלטות האמיתיות. עוזרת לי מועצת הקהילה שהקמתי. עוזר לי המנהל, שנותן לי מקום. עוזרות לי המחנכות הטובות, שעושות את העבודה היומיומית ושאני רק מגבה. ועוזרת לי ההיסטוריה: כשאני מלמדת ילדים על לוד, על המשפחות שלהם, על מה שהיה פה, ההורים באים לשמוע, והסבתות באות לספר, והקשר נבנה דרך גאווה ולא דרך בעיות. הכשרה: תואר שני בחינוך נתן לי מושגים, "הון חברתי", "שותפות", אבל שום דבר על קהילה ערבית בעיר מעורבת. קורס רכזי חינוך חברתי לא עסק בהורים בכלל. ליווי, אין, ואני כבר הליווי של אחרות. מה שהיה עוזר: פורום של רכזות ורכזי קהילה מבתי ספר ערביים בערים מעורבות, לוד, רמלה, יפו, עכו, כי הבעיות שלנו דומות ואף אחד לא מדבר עליהן יחד.</w:t>
       </w:r>
     </w:p>
     <w:p>
@@ -11029,7 +11029,7 @@
           <w:szCs w:val="24"/>
           <w:rtl/>
         </w:rPr>
-        <w:t xml:space="preserve">ברמת המורה: להכיר את המשפחה לפני שמכירים את הבעיה. ללכת לאירועים של הקהילה. ולהבין שבלוד הקשר עם ההורה הוא קשר עם משפחה, ושלפעמים הכתובת היא הסבא. ברמת בית הספר: רכז קהילה בכל בית ספר, עם שעות. מועצת קהילה לצד ועד ההורים. תוכנית לקשר עם ההורים שמותאמת למבנה הקהילה. הכשרה למורות על החברה של לוד, לא על "הורים" בכלל. ולהחזיר את ההיסטוריה של העיר לבית הספר, כי הורים באים למקום שמכבד את מי שהם. ברמת העירייה: להפסיק לראות בבתי הספר הערביים "בעיה" ולהתחיל לראות בהם שותף. ערבית בכל תקשורת. מרכזים קהילתיים שהקהילה מנהלת, לא שהעירייה מפעילה. השקעה בשכונות: תאורה, מגרשים, מדרכות, כי הורים לא באים לאסיפת הורים ברחוב בלי תאורה. ושיתוף של ראשי המשפחות בהחלטות של העירייה על השכונות שלהם, כי היום מחליטים עליהם בלעדיהם, ואז מתפלאים שהם לא משתפים פעולה. וביטחון, כמובן, אבל ביטחון שמגיע דרך הקהילה, לא רק דרך המשטרה.</w:t>
+        <w:t xml:space="preserve">ברמת המורה: להכיר את המשפחה לפני שמכירים את הבעיה. ללכת לאירועים של הקהילה. ולהבין שבלוד הקשר עם ההורה הוא קשר עם משפחה, ושלפעמים הכתובת היא הסבתא. ברמת בית הספר: רכזת קהילה בכל בית ספר, עם שעות. מועצת קהילה לצד ועד ההורים. תוכנית לקשר עם ההורים שמותאמת למבנה הקהילה. הכשרה למורות על החברה של לוד, לא על "הורים" בכלל. ולהחזיר את ההיסטוריה של העיר לבית הספר, כי הורים באים למקום שמכבד את מי שהם. ברמת העירייה: להפסיק לראות בבתי הספר הערביים "בעיה" ולהתחיל לראות בהם שותף. ערבית בכל תקשורת. מרכזים קהילתיים שהקהילה מנהלת, לא שהעירייה מפעילה, ושיהיה בהם מקום לנשים. השקעה בשכונות: תאורה, מגרשים, מדרכות, כי הורים לא באים לאסיפת הורים ברחוב בלי תאורה. ושיתוף של ראשי המשפחות, ושל הנשים שמנהלות אותן בפועל, בהחלטות של העירייה על השכונות שלהם, כי היום מחליטים עליהם בלעדיהם, ואז מתפלאים שהם לא משתפים פעולה. וביטחון, כמובן, אבל ביטחון שמגיע דרך הקהילה, לא רק דרך המשטרה.</w:t>
       </w:r>
     </w:p>
     <w:p>
@@ -11089,7 +11089,7 @@
           <w:szCs w:val="24"/>
           <w:rtl/>
         </w:rPr>
-        <w:t xml:space="preserve">המסר שלי הוא שהשותפות עם ההורים בלוד לא תיבנה במודל של משרד החינוך, אלא במודל של הקהילה. הקהילה הערבית בלוד היא קהילה של משפחות, של כבוד, של זקנים, ובית ספר שמכבד את זה יקבל את ההורים, ובית ספר שמנסה לכפות ועד נבחר ואסיפות ומשו"ב יקבל שתיקה. אני לא אומר שהמבנה הישן מושלם, הוא לא, ואני רואה את החולשות שלו כל יום. אבל הוא קיים, והוא מה שיש, ואפשר לבנות עליו. ולמחקר: תכתבי על בית הספר הערבי בעיר המעורבת כמוסד קהילתי, לא רק חינוכי. בלוד, אל-ראזי הוא לא רק חטיבת ביניים. הוא המקום היחיד שבו כל המשפחות הערביות של העיר נפגשות בשלום. זה שווה יותר ממה שהמערכת יודעת למדוד.</w:t>
+        <w:t xml:space="preserve">המסר שלי הוא שהשותפות עם ההורים בלוד לא תיבנה במודל של משרד החינוך, אלא במודל של הקהילה. הקהילה הערבית בלוד היא קהילה של משפחות, של כבוד, של זקנים וזקנות, ובית ספר שמכבד את זה יקבל את ההורים, ובית ספר שמנסה לכפות ועד נבחר ואסיפות ומשו"ב יקבל שתיקה. אני לא אומרת שהמבנה הישן מושלם, הוא לא, ואני כאישה רואה את החולשות שלו כל יום. אבל הוא קיים, והוא מה שיש, ואפשר לבנות עליו, ובעיקר דרך הנשים שבתוכו, שאף אחד לא רואה. ולמחקר: תכתבי על בית הספר הערבי בעיר המעורבת כמוסד קהילתי, לא רק חינוכי. בלוד, אל-ראזי הוא לא רק חטיבת ביניים. הוא המקום היחיד שבו כל המשפחות הערביות של העיר נפגשות בשלום. זה שווה יותר ממה שהמערכת יודעת למדוד.</w:t>
       </w:r>
     </w:p>
     <w:p>
@@ -11142,7 +11142,7 @@
           <w:szCs w:val="24"/>
           <w:rtl/>
         </w:rPr>
-        <w:t xml:space="preserve">מגדר: גבר</w:t>
+        <w:t xml:space="preserve">מגדר: אישה</w:t>
       </w:r>
     </w:p>
     <w:p>
@@ -11210,7 +11210,7 @@
           <w:szCs w:val="24"/>
           <w:rtl/>
         </w:rPr>
-        <w:t xml:space="preserve">תפקיד בבית הספר: רכז חינוך חברתי ומורה להיסטוריה</w:t>
+        <w:t xml:space="preserve">תפקיד בבית הספר: רכזת חינוך חברתי ומורה להיסטוריה</w:t>
       </w:r>
     </w:p>
     <w:p>

</xml_diff>